<commit_message>
added custom notes to each run + added refinement.log file
</commit_message>
<xml_diff>
--- a/Report.docx
+++ b/Report.docx
@@ -16,7 +16,64 @@
           <w:b/>
           <w:bCs/>
         </w:rPr>
-        <w:t>Satellite-to-Map Image Translation Using Pix2Pix GAN</w:t>
+        <w:t xml:space="preserve">Satellite-to-Map Image Translation Using </w:t>
+      </w:r>
+    </w:p>
+    <w:p>
+      <w:pPr>
+        <w:pStyle w:val="Title"/>
+        <w:jc w:val="center"/>
+        <w:rPr>
+          <w:b/>
+          <w:bCs/>
+        </w:rPr>
+      </w:pPr>
+      <w:r>
+        <w:rPr>
+          <w:b/>
+          <w:bCs/>
+        </w:rPr>
+        <w:t>Pix2Pix GAN</w:t>
+      </w:r>
+    </w:p>
+    <w:p/>
+    <w:p>
+      <w:r>
+        <w:drawing>
+          <wp:inline distT="0" distB="0" distL="0" distR="0" wp14:anchorId="12BAC62B" wp14:editId="11E5A734">
+            <wp:extent cx="5943600" cy="5073650"/>
+            <wp:effectExtent l="0" t="0" r="0" b="0"/>
+            <wp:docPr id="1" name="Picture 1"/>
+            <wp:cNvGraphicFramePr>
+              <a:graphicFrameLocks xmlns:a="http://schemas.openxmlformats.org/drawingml/2006/main" noChangeAspect="1"/>
+            </wp:cNvGraphicFramePr>
+            <a:graphic xmlns:a="http://schemas.openxmlformats.org/drawingml/2006/main">
+              <a:graphicData uri="http://schemas.openxmlformats.org/drawingml/2006/picture">
+                <pic:pic xmlns:pic="http://schemas.openxmlformats.org/drawingml/2006/picture">
+                  <pic:nvPicPr>
+                    <pic:cNvPr id="1" name=""/>
+                    <pic:cNvPicPr/>
+                  </pic:nvPicPr>
+                  <pic:blipFill>
+                    <a:blip r:embed="rId4"/>
+                    <a:stretch>
+                      <a:fillRect/>
+                    </a:stretch>
+                  </pic:blipFill>
+                  <pic:spPr>
+                    <a:xfrm>
+                      <a:off x="0" y="0"/>
+                      <a:ext cx="5943600" cy="5073650"/>
+                    </a:xfrm>
+                    <a:prstGeom prst="rect">
+                      <a:avLst/>
+                    </a:prstGeom>
+                  </pic:spPr>
+                </pic:pic>
+              </a:graphicData>
+            </a:graphic>
+          </wp:inline>
+        </w:drawing>
       </w:r>
     </w:p>
     <w:sectPr>

</xml_diff>

<commit_message>
64x64 last commit .Did some more experiments and refinements
</commit_message>
<xml_diff>
--- a/Report.docx
+++ b/Report.docx
@@ -39,6 +39,9 @@
     <w:p/>
     <w:p>
       <w:r>
+        <w:rPr>
+          <w:noProof/>
+        </w:rPr>
         <w:drawing>
           <wp:inline distT="0" distB="0" distL="0" distR="0" wp14:anchorId="12BAC62B" wp14:editId="11E5A734">
             <wp:extent cx="5943600" cy="5073650"/>
@@ -64,6 +67,89 @@
                     <a:xfrm>
                       <a:off x="0" y="0"/>
                       <a:ext cx="5943600" cy="5073650"/>
+                    </a:xfrm>
+                    <a:prstGeom prst="rect">
+                      <a:avLst/>
+                    </a:prstGeom>
+                  </pic:spPr>
+                </pic:pic>
+              </a:graphicData>
+            </a:graphic>
+          </wp:inline>
+        </w:drawing>
+      </w:r>
+    </w:p>
+    <w:p>
+      <w:r>
+        <w:rPr>
+          <w:noProof/>
+        </w:rPr>
+        <w:lastRenderedPageBreak/>
+        <w:drawing>
+          <wp:inline distT="0" distB="0" distL="0" distR="0" wp14:anchorId="4D175506" wp14:editId="5F1104B7">
+            <wp:extent cx="5943600" cy="8081010"/>
+            <wp:effectExtent l="0" t="0" r="0" b="0"/>
+            <wp:docPr id="2" name="Picture 2"/>
+            <wp:cNvGraphicFramePr>
+              <a:graphicFrameLocks xmlns:a="http://schemas.openxmlformats.org/drawingml/2006/main" noChangeAspect="1"/>
+            </wp:cNvGraphicFramePr>
+            <a:graphic xmlns:a="http://schemas.openxmlformats.org/drawingml/2006/main">
+              <a:graphicData uri="http://schemas.openxmlformats.org/drawingml/2006/picture">
+                <pic:pic xmlns:pic="http://schemas.openxmlformats.org/drawingml/2006/picture">
+                  <pic:nvPicPr>
+                    <pic:cNvPr id="1" name=""/>
+                    <pic:cNvPicPr/>
+                  </pic:nvPicPr>
+                  <pic:blipFill>
+                    <a:blip r:embed="rId5"/>
+                    <a:stretch>
+                      <a:fillRect/>
+                    </a:stretch>
+                  </pic:blipFill>
+                  <pic:spPr>
+                    <a:xfrm>
+                      <a:off x="0" y="0"/>
+                      <a:ext cx="5943600" cy="8081010"/>
+                    </a:xfrm>
+                    <a:prstGeom prst="rect">
+                      <a:avLst/>
+                    </a:prstGeom>
+                  </pic:spPr>
+                </pic:pic>
+              </a:graphicData>
+            </a:graphic>
+          </wp:inline>
+        </w:drawing>
+      </w:r>
+    </w:p>
+    <w:p>
+      <w:r>
+        <w:lastRenderedPageBreak/>
+        <w:drawing>
+          <wp:inline distT="0" distB="0" distL="0" distR="0" wp14:anchorId="5A9C6403" wp14:editId="3CB5BC0E">
+            <wp:extent cx="5582429" cy="2219635"/>
+            <wp:effectExtent l="0" t="0" r="0" b="9525"/>
+            <wp:docPr id="3" name="Picture 3"/>
+            <wp:cNvGraphicFramePr>
+              <a:graphicFrameLocks xmlns:a="http://schemas.openxmlformats.org/drawingml/2006/main" noChangeAspect="1"/>
+            </wp:cNvGraphicFramePr>
+            <a:graphic xmlns:a="http://schemas.openxmlformats.org/drawingml/2006/main">
+              <a:graphicData uri="http://schemas.openxmlformats.org/drawingml/2006/picture">
+                <pic:pic xmlns:pic="http://schemas.openxmlformats.org/drawingml/2006/picture">
+                  <pic:nvPicPr>
+                    <pic:cNvPr id="1" name=""/>
+                    <pic:cNvPicPr/>
+                  </pic:nvPicPr>
+                  <pic:blipFill>
+                    <a:blip r:embed="rId6"/>
+                    <a:stretch>
+                      <a:fillRect/>
+                    </a:stretch>
+                  </pic:blipFill>
+                  <pic:spPr>
+                    <a:xfrm>
+                      <a:off x="0" y="0"/>
+                      <a:ext cx="5582429" cy="2219635"/>
                     </a:xfrm>
                     <a:prstGeom prst="rect">
                       <a:avLst/>

</xml_diff>

<commit_message>
updated everything to 128x128 image size + added one layer of depth to generator + added and used PatchGan64x64
</commit_message>
<xml_diff>
--- a/Report.docx
+++ b/Report.docx
@@ -124,6 +124,9 @@
     </w:p>
     <w:p>
       <w:r>
+        <w:rPr>
+          <w:noProof/>
+        </w:rPr>
         <w:lastRenderedPageBreak/>
         <w:drawing>
           <wp:inline distT="0" distB="0" distL="0" distR="0" wp14:anchorId="5A9C6403" wp14:editId="3CB5BC0E">
@@ -150,6 +153,115 @@
                     <a:xfrm>
                       <a:off x="0" y="0"/>
                       <a:ext cx="5582429" cy="2219635"/>
+                    </a:xfrm>
+                    <a:prstGeom prst="rect">
+                      <a:avLst/>
+                    </a:prstGeom>
+                  </pic:spPr>
+                </pic:pic>
+              </a:graphicData>
+            </a:graphic>
+          </wp:inline>
+        </w:drawing>
+      </w:r>
+    </w:p>
+    <w:p>
+      <w:r>
+        <w:rPr>
+          <w:b/>
+          <w:bCs/>
+        </w:rPr>
+        <w:t>Generator</w:t>
+      </w:r>
+      <w:r>
+        <w:t xml:space="preserve"> update I need to do:</w:t>
+      </w:r>
+    </w:p>
+    <w:p>
+      <w:pPr>
+        <w:rPr>
+          <w:b/>
+          <w:bCs/>
+        </w:rPr>
+      </w:pPr>
+      <w:r>
+        <w:drawing>
+          <wp:inline distT="0" distB="0" distL="0" distR="0" wp14:anchorId="5F7E2D7A" wp14:editId="2CA8235E">
+            <wp:extent cx="5943600" cy="3220720"/>
+            <wp:effectExtent l="0" t="0" r="0" b="0"/>
+            <wp:docPr id="4" name="Picture 4"/>
+            <wp:cNvGraphicFramePr>
+              <a:graphicFrameLocks xmlns:a="http://schemas.openxmlformats.org/drawingml/2006/main" noChangeAspect="1"/>
+            </wp:cNvGraphicFramePr>
+            <a:graphic xmlns:a="http://schemas.openxmlformats.org/drawingml/2006/main">
+              <a:graphicData uri="http://schemas.openxmlformats.org/drawingml/2006/picture">
+                <pic:pic xmlns:pic="http://schemas.openxmlformats.org/drawingml/2006/picture">
+                  <pic:nvPicPr>
+                    <pic:cNvPr id="1" name=""/>
+                    <pic:cNvPicPr/>
+                  </pic:nvPicPr>
+                  <pic:blipFill>
+                    <a:blip r:embed="rId7"/>
+                    <a:stretch>
+                      <a:fillRect/>
+                    </a:stretch>
+                  </pic:blipFill>
+                  <pic:spPr>
+                    <a:xfrm>
+                      <a:off x="0" y="0"/>
+                      <a:ext cx="5943600" cy="3220720"/>
+                    </a:xfrm>
+                    <a:prstGeom prst="rect">
+                      <a:avLst/>
+                    </a:prstGeom>
+                  </pic:spPr>
+                </pic:pic>
+              </a:graphicData>
+            </a:graphic>
+          </wp:inline>
+        </w:drawing>
+      </w:r>
+    </w:p>
+    <w:p>
+      <w:r>
+        <w:rPr>
+          <w:b/>
+          <w:bCs/>
+        </w:rPr>
+        <w:t>Discriminator</w:t>
+      </w:r>
+      <w:r>
+        <w:t xml:space="preserve"> update I need to do:</w:t>
+      </w:r>
+    </w:p>
+    <w:p>
+      <w:r>
+        <w:lastRenderedPageBreak/>
+        <w:drawing>
+          <wp:inline distT="0" distB="0" distL="0" distR="0" wp14:anchorId="1516956E" wp14:editId="24DAA88E">
+            <wp:extent cx="5943600" cy="4218305"/>
+            <wp:effectExtent l="0" t="0" r="0" b="0"/>
+            <wp:docPr id="5" name="Picture 5"/>
+            <wp:cNvGraphicFramePr>
+              <a:graphicFrameLocks xmlns:a="http://schemas.openxmlformats.org/drawingml/2006/main" noChangeAspect="1"/>
+            </wp:cNvGraphicFramePr>
+            <a:graphic xmlns:a="http://schemas.openxmlformats.org/drawingml/2006/main">
+              <a:graphicData uri="http://schemas.openxmlformats.org/drawingml/2006/picture">
+                <pic:pic xmlns:pic="http://schemas.openxmlformats.org/drawingml/2006/picture">
+                  <pic:nvPicPr>
+                    <pic:cNvPr id="1" name=""/>
+                    <pic:cNvPicPr/>
+                  </pic:nvPicPr>
+                  <pic:blipFill>
+                    <a:blip r:embed="rId8"/>
+                    <a:stretch>
+                      <a:fillRect/>
+                    </a:stretch>
+                  </pic:blipFill>
+                  <pic:spPr>
+                    <a:xfrm>
+                      <a:off x="0" y="0"/>
+                      <a:ext cx="5943600" cy="4218305"/>
                     </a:xfrm>
                     <a:prstGeom prst="rect">
                       <a:avLst/>

</xml_diff>

<commit_message>
Report done. Porject finished
</commit_message>
<xml_diff>
--- a/Report.docx
+++ b/Report.docx
@@ -79,8 +79,27 @@
       </w:r>
     </w:p>
     <w:p>
-      <w:r>
-        <w:t>&lt;&lt; Write here &gt;&gt;</w:t>
+      <w:pPr>
+        <w:spacing w:line="360" w:lineRule="auto"/>
+      </w:pPr>
+      <w:r>
+        <w:t>This project implements a modular, end-to-end satellite-to-map image translation system using a conditional Generative Adversarial Network (</w:t>
+      </w:r>
+      <w:proofErr w:type="spellStart"/>
+      <w:r>
+        <w:t>cGAN</w:t>
+      </w:r>
+      <w:proofErr w:type="spellEnd"/>
+      <w:r>
+        <w:t xml:space="preserve">) based on the pix2pix framework. The model is trained on a paired dataset of approximately 1,500 satellite–map images, which are preprocessed, aligned, and scaled to 128×128 resolution. The architecture employs a U-Net generator and a </w:t>
+      </w:r>
+      <w:proofErr w:type="spellStart"/>
+      <w:r>
+        <w:t>PatchGAN</w:t>
+      </w:r>
+      <w:proofErr w:type="spellEnd"/>
+      <w:r>
+        <w:t xml:space="preserve"> discriminator, optimized through a composite loss function combining adversarial, L1 reconstruction, and SSIM-based perceptual objectives. The system is designed with production-grade modularity, separating data handling, training, evaluation, and deployment into distinct components. Despite dataset and computational constraints, the final model achieves improved structural consistency and realism, as validated by quantitative metrics (SSIM ≈ 0.65, PSNR ≈ 21.3) and qualitative analysis. This work demonstrates the feasibility of conditional GANs for automated map generation and provides a reproducible, scalable foundation for further development in remote sensing and geospatial visualization.</w:t>
       </w:r>
       <w:r>
         <w:br/>
@@ -112,7 +131,6 @@
         <w:pStyle w:val="Heading1"/>
       </w:pPr>
       <w:r>
-        <w:lastRenderedPageBreak/>
         <w:t>1. Introduction</w:t>
       </w:r>
       <w:r>
@@ -226,7 +244,11 @@
         <w:t>1,500 paired satellite–map</w:t>
       </w:r>
       <w:r>
-        <w:t xml:space="preserve"> images designed for supervised image-to-image translation. Each raw sample is provided as a single composite image with a resolution of </w:t>
+        <w:t xml:space="preserve"> images designed for supervised image-to-image translation. Each raw sample is provided as </w:t>
+      </w:r>
+      <w:r>
+        <w:lastRenderedPageBreak/>
+        <w:t xml:space="preserve">a single composite image with a resolution of </w:t>
       </w:r>
       <w:r>
         <w:rPr>
@@ -316,7 +338,6 @@
         </w:rPr>
       </w:pPr>
       <w:r>
-        <w:lastRenderedPageBreak/>
         <w:br/>
       </w:r>
       <w:r>
@@ -541,6 +562,7 @@
     </w:p>
     <w:p>
       <w:r>
+        <w:lastRenderedPageBreak/>
         <w:t>A dedicated preprocessing pipeline was implemented to transform raw composite images into a structured dataset suitable for conditional GAN training. The preprocessing workflow includes the following steps:</w:t>
       </w:r>
     </w:p>
@@ -876,6 +898,7 @@
     </w:p>
     <w:p>
       <w:r>
+        <w:lastRenderedPageBreak/>
         <w:t xml:space="preserve">The </w:t>
       </w:r>
       <w:r>
@@ -1024,7 +1047,6 @@
     </w:p>
     <w:p>
       <w:r>
-        <w:lastRenderedPageBreak/>
         <w:t xml:space="preserve">where </w:t>
       </w:r>
       <w:r>
@@ -1263,6 +1285,7 @@
           <w:b/>
           <w:bCs/>
         </w:rPr>
+        <w:lastRenderedPageBreak/>
         <w:t>Architecture</w:t>
       </w:r>
       <w:r>
@@ -1436,220 +1459,223 @@
           <w:b/>
           <w:bCs/>
         </w:rPr>
+        <w:t>Encoder</w:t>
+      </w:r>
+      <w:r>
+        <w:t xml:space="preserve"> (</w:t>
+      </w:r>
+      <w:r>
+        <w:rPr>
+          <w:b/>
+          <w:bCs/>
+        </w:rPr>
+        <w:t>Downsampling</w:t>
+      </w:r>
+      <w:r>
+        <w:t xml:space="preserve"> Path)</w:t>
+      </w:r>
+    </w:p>
+    <w:p>
+      <w:pPr>
+        <w:ind w:left="720"/>
+      </w:pPr>
+      <w:r>
+        <w:t xml:space="preserve">The encoder consists of </w:t>
+      </w:r>
+      <w:r>
+        <w:rPr>
+          <w:b/>
+          <w:bCs/>
+        </w:rPr>
+        <w:t>four</w:t>
+      </w:r>
+      <w:r>
+        <w:t xml:space="preserve"> downsampling blocks, where each block reduces the spatial resolution while increasing the number of feature channels starting from a </w:t>
+      </w:r>
+      <w:r>
+        <w:rPr>
+          <w:b/>
+          <w:bCs/>
+        </w:rPr>
+        <w:t>base width</w:t>
+      </w:r>
+      <w:r>
+        <w:t xml:space="preserve"> of </w:t>
+      </w:r>
+      <w:r>
+        <w:rPr>
+          <w:b/>
+          <w:bCs/>
+        </w:rPr>
+        <w:t>64 filters</w:t>
+      </w:r>
+      <w:r>
+        <w:t>. This allows the network to extract increasingly abstract representations of spatial patterns such as road layouts, intersections, and urban regions.</w:t>
+      </w:r>
+    </w:p>
+    <w:p>
+      <w:pPr>
+        <w:ind w:left="720"/>
+        <w:rPr>
+          <w:b/>
+          <w:bCs/>
+        </w:rPr>
+      </w:pPr>
+      <w:r>
+        <w:rPr>
+          <w:b/>
+          <w:bCs/>
+        </w:rPr>
+        <w:t>Bottleneck</w:t>
+      </w:r>
+    </w:p>
+    <w:p>
+      <w:pPr>
+        <w:ind w:left="720"/>
+      </w:pPr>
+      <w:r>
+        <w:t xml:space="preserve">The bottleneck layer aggregates global contextual information before reconstruction, acting as a </w:t>
+      </w:r>
+      <w:r>
+        <w:rPr>
+          <w:b/>
+          <w:bCs/>
+        </w:rPr>
+        <w:t>compressed latent representation</w:t>
+      </w:r>
+      <w:r>
+        <w:t xml:space="preserve"> of the input satellite image.</w:t>
+      </w:r>
+    </w:p>
+    <w:p>
+      <w:pPr>
+        <w:ind w:left="720"/>
+      </w:pPr>
+      <w:r>
+        <w:rPr>
+          <w:b/>
+          <w:bCs/>
+        </w:rPr>
+        <w:t>Decoder</w:t>
+      </w:r>
+      <w:r>
+        <w:t xml:space="preserve"> (</w:t>
+      </w:r>
+      <w:proofErr w:type="spellStart"/>
+      <w:r>
+        <w:rPr>
+          <w:b/>
+          <w:bCs/>
+        </w:rPr>
+        <w:t>Upsampling</w:t>
+      </w:r>
+      <w:proofErr w:type="spellEnd"/>
+      <w:r>
+        <w:t xml:space="preserve"> Path)</w:t>
+      </w:r>
+    </w:p>
+    <w:p>
+      <w:pPr>
+        <w:ind w:left="720"/>
+      </w:pPr>
+      <w:r>
+        <w:t xml:space="preserve">The decoder </w:t>
+      </w:r>
+      <w:r>
+        <w:rPr>
+          <w:b/>
+          <w:bCs/>
+        </w:rPr>
+        <w:t>mirrors</w:t>
+      </w:r>
+      <w:r>
+        <w:t xml:space="preserve"> the encoder structure, progressively </w:t>
+      </w:r>
+      <w:r>
+        <w:rPr>
+          <w:b/>
+          <w:bCs/>
+        </w:rPr>
+        <w:t>restoring</w:t>
+      </w:r>
+      <w:r>
+        <w:t xml:space="preserve"> spatial resolution through </w:t>
+      </w:r>
+      <w:proofErr w:type="spellStart"/>
+      <w:r>
+        <w:t>upsampling</w:t>
+      </w:r>
+      <w:proofErr w:type="spellEnd"/>
+      <w:r>
+        <w:t xml:space="preserve"> layers and generating the final </w:t>
+      </w:r>
+      <w:r>
+        <w:rPr>
+          <w:b/>
+          <w:bCs/>
+        </w:rPr>
+        <w:t>map-style output</w:t>
+      </w:r>
+      <w:r>
+        <w:t>.</w:t>
+      </w:r>
+    </w:p>
+    <w:p>
+      <w:pPr>
+        <w:ind w:left="720"/>
+      </w:pPr>
+    </w:p>
+    <w:p>
+      <w:pPr>
+        <w:ind w:left="720"/>
+      </w:pPr>
+      <w:r>
+        <w:t xml:space="preserve">All intermediate layers use </w:t>
+      </w:r>
+      <w:proofErr w:type="spellStart"/>
+      <w:r>
+        <w:rPr>
+          <w:b/>
+          <w:bCs/>
+        </w:rPr>
+        <w:t>LeakyReLU</w:t>
+      </w:r>
+      <w:proofErr w:type="spellEnd"/>
+      <w:r>
+        <w:t xml:space="preserve"> activations, while the final output layer applies a Tanh activation function, ensuring compatibility with input images normalized to the range [−1,1].</w:t>
+      </w:r>
+    </w:p>
+    <w:p>
+      <w:pPr>
+        <w:ind w:left="720"/>
+      </w:pPr>
+    </w:p>
+    <w:p>
+      <w:pPr>
+        <w:ind w:left="720"/>
+        <w:rPr>
+          <w:b/>
+          <w:bCs/>
+        </w:rPr>
+      </w:pPr>
+      <w:r>
+        <w:rPr>
+          <w:b/>
+          <w:bCs/>
+        </w:rPr>
+        <w:t>Skip Connections</w:t>
+      </w:r>
+    </w:p>
+    <w:p>
+      <w:pPr>
+        <w:ind w:left="720"/>
+      </w:pPr>
+      <w:r>
+        <w:t>A defining characteristic of the U-Net architecture is the use of skip connections between corresponding encoder and decoder layers. These connections allow low-</w:t>
+      </w:r>
+      <w:r>
         <w:lastRenderedPageBreak/>
-        <w:t>Encoder</w:t>
-      </w:r>
-      <w:r>
-        <w:t xml:space="preserve"> (</w:t>
-      </w:r>
-      <w:r>
-        <w:rPr>
-          <w:b/>
-          <w:bCs/>
-        </w:rPr>
-        <w:t>Downsampling</w:t>
-      </w:r>
-      <w:r>
-        <w:t xml:space="preserve"> Path)</w:t>
-      </w:r>
-    </w:p>
-    <w:p>
-      <w:pPr>
-        <w:ind w:left="720"/>
-      </w:pPr>
-      <w:r>
-        <w:t xml:space="preserve">The encoder consists of </w:t>
-      </w:r>
-      <w:r>
-        <w:rPr>
-          <w:b/>
-          <w:bCs/>
-        </w:rPr>
-        <w:t>four</w:t>
-      </w:r>
-      <w:r>
-        <w:t xml:space="preserve"> downsampling blocks, where each block reduces the spatial resolution while increasing the number of feature channels starting from a </w:t>
-      </w:r>
-      <w:r>
-        <w:rPr>
-          <w:b/>
-          <w:bCs/>
-        </w:rPr>
-        <w:t>base width</w:t>
-      </w:r>
-      <w:r>
-        <w:t xml:space="preserve"> of </w:t>
-      </w:r>
-      <w:r>
-        <w:rPr>
-          <w:b/>
-          <w:bCs/>
-        </w:rPr>
-        <w:t>64 filters</w:t>
-      </w:r>
-      <w:r>
-        <w:t>. This allows the network to extract increasingly abstract representations of spatial patterns such as road layouts, intersections, and urban regions.</w:t>
-      </w:r>
-    </w:p>
-    <w:p>
-      <w:pPr>
-        <w:ind w:left="720"/>
-        <w:rPr>
-          <w:b/>
-          <w:bCs/>
-        </w:rPr>
-      </w:pPr>
-      <w:r>
-        <w:rPr>
-          <w:b/>
-          <w:bCs/>
-        </w:rPr>
-        <w:t>Bottleneck</w:t>
-      </w:r>
-    </w:p>
-    <w:p>
-      <w:pPr>
-        <w:ind w:left="720"/>
-      </w:pPr>
-      <w:r>
-        <w:t xml:space="preserve">The bottleneck layer aggregates global contextual information before reconstruction, acting as a </w:t>
-      </w:r>
-      <w:r>
-        <w:rPr>
-          <w:b/>
-          <w:bCs/>
-        </w:rPr>
-        <w:t>compressed latent representation</w:t>
-      </w:r>
-      <w:r>
-        <w:t xml:space="preserve"> of the input satellite image.</w:t>
-      </w:r>
-    </w:p>
-    <w:p>
-      <w:pPr>
-        <w:ind w:left="720"/>
-      </w:pPr>
-      <w:r>
-        <w:rPr>
-          <w:b/>
-          <w:bCs/>
-        </w:rPr>
-        <w:t>Decoder</w:t>
-      </w:r>
-      <w:r>
-        <w:t xml:space="preserve"> (</w:t>
-      </w:r>
-      <w:proofErr w:type="spellStart"/>
-      <w:r>
-        <w:rPr>
-          <w:b/>
-          <w:bCs/>
-        </w:rPr>
-        <w:t>Upsampling</w:t>
-      </w:r>
-      <w:proofErr w:type="spellEnd"/>
-      <w:r>
-        <w:t xml:space="preserve"> Path)</w:t>
-      </w:r>
-    </w:p>
-    <w:p>
-      <w:pPr>
-        <w:ind w:left="720"/>
-      </w:pPr>
-      <w:r>
-        <w:t xml:space="preserve">The decoder </w:t>
-      </w:r>
-      <w:r>
-        <w:rPr>
-          <w:b/>
-          <w:bCs/>
-        </w:rPr>
-        <w:t>mirrors</w:t>
-      </w:r>
-      <w:r>
-        <w:t xml:space="preserve"> the encoder structure, progressively </w:t>
-      </w:r>
-      <w:r>
-        <w:rPr>
-          <w:b/>
-          <w:bCs/>
-        </w:rPr>
-        <w:t>restoring</w:t>
-      </w:r>
-      <w:r>
-        <w:t xml:space="preserve"> spatial resolution through </w:t>
-      </w:r>
-      <w:proofErr w:type="spellStart"/>
-      <w:r>
-        <w:t>upsampling</w:t>
-      </w:r>
-      <w:proofErr w:type="spellEnd"/>
-      <w:r>
-        <w:t xml:space="preserve"> layers and generating the final </w:t>
-      </w:r>
-      <w:r>
-        <w:rPr>
-          <w:b/>
-          <w:bCs/>
-        </w:rPr>
-        <w:t>map-style output</w:t>
-      </w:r>
-      <w:r>
-        <w:t>.</w:t>
-      </w:r>
-    </w:p>
-    <w:p>
-      <w:pPr>
-        <w:ind w:left="720"/>
-      </w:pPr>
-    </w:p>
-    <w:p>
-      <w:pPr>
-        <w:ind w:left="720"/>
-      </w:pPr>
-      <w:r>
-        <w:t xml:space="preserve">All intermediate layers use </w:t>
-      </w:r>
-      <w:proofErr w:type="spellStart"/>
-      <w:r>
-        <w:rPr>
-          <w:b/>
-          <w:bCs/>
-        </w:rPr>
-        <w:t>LeakyReLU</w:t>
-      </w:r>
-      <w:proofErr w:type="spellEnd"/>
-      <w:r>
-        <w:t xml:space="preserve"> activations, while the final output layer applies a Tanh activation function, ensuring compatibility with input images normalized to the range [−1,1].</w:t>
-      </w:r>
-    </w:p>
-    <w:p>
-      <w:pPr>
-        <w:ind w:left="720"/>
-      </w:pPr>
-    </w:p>
-    <w:p>
-      <w:pPr>
-        <w:ind w:left="720"/>
-        <w:rPr>
-          <w:b/>
-          <w:bCs/>
-        </w:rPr>
-      </w:pPr>
-      <w:r>
-        <w:rPr>
-          <w:b/>
-          <w:bCs/>
-        </w:rPr>
-        <w:t>Skip Connections</w:t>
-      </w:r>
-    </w:p>
-    <w:p>
-      <w:pPr>
-        <w:ind w:left="720"/>
-      </w:pPr>
-      <w:r>
-        <w:t>A defining characteristic of the U-Net architecture is the use of skip connections between corresponding encoder and decoder layers. These connections allow low-level spatial features—such as edges, boundaries, and linear structures—to bypass the bottleneck and be directly reused during reconstruction.</w:t>
+        <w:t>level spatial features—such as edges, boundaries, and linear structures—to bypass the bottleneck and be directly reused during reconstruction.</w:t>
       </w:r>
     </w:p>
     <w:p>
@@ -1739,7 +1765,6 @@
     </w:p>
     <w:p>
       <w:r>
-        <w:lastRenderedPageBreak/>
         <w:t>Reference implementation:</w:t>
       </w:r>
       <w:proofErr w:type="gramStart"/>
@@ -2018,6 +2043,7 @@
         </w:numPr>
       </w:pPr>
       <w:r>
+        <w:lastRenderedPageBreak/>
         <w:t>Local spatial consistency</w:t>
       </w:r>
     </w:p>
@@ -2407,7 +2433,11 @@
         <w:t>L1</w:t>
       </w:r>
       <w:r>
-        <w:t xml:space="preserve"> reconstruction loss. The generator directly learns a mapping from satellite images to map images without adversarial feedback. This setup provides a </w:t>
+        <w:t xml:space="preserve"> reconstruction loss. The generator directly learns a mapping from satellite images to map </w:t>
+      </w:r>
+      <w:r>
+        <w:lastRenderedPageBreak/>
+        <w:t xml:space="preserve">images without adversarial feedback. This setup provides a </w:t>
       </w:r>
       <w:r>
         <w:rPr>
@@ -2566,7 +2596,6 @@
     </w:p>
     <w:p>
       <w:r>
-        <w:lastRenderedPageBreak/>
         <w:t xml:space="preserve">This alternating optimization is essential for conditional GAN training but introduces inherent </w:t>
       </w:r>
       <w:r>
@@ -2885,6 +2914,7 @@
         <w:ind w:firstLine="720"/>
       </w:pPr>
       <w:r>
+        <w:lastRenderedPageBreak/>
         <w:t xml:space="preserve">4.2.1 </w:t>
       </w:r>
       <w:r>
@@ -3056,7 +3086,6 @@
           <w:b/>
           <w:bCs/>
         </w:rPr>
-        <w:lastRenderedPageBreak/>
         <w:t>SSIM</w:t>
       </w:r>
       <w:r>
@@ -3220,6 +3249,7 @@
         <w:pStyle w:val="Heading1"/>
       </w:pPr>
       <w:r>
+        <w:lastRenderedPageBreak/>
         <w:t>5. Evaluation &amp; Metrics</w:t>
       </w:r>
       <w:r>
@@ -3318,7 +3348,6 @@
     </w:p>
     <w:p>
       <w:r>
-        <w:lastRenderedPageBreak/>
         <w:t xml:space="preserve">For evaluation, the best-performing generator checkpoint (selected based on </w:t>
       </w:r>
       <w:r>
@@ -3563,6 +3592,7 @@
     <w:p/>
     <w:p>
       <w:r>
+        <w:lastRenderedPageBreak/>
         <w:t>Reference</w:t>
       </w:r>
       <w:proofErr w:type="gramStart"/>
@@ -3864,7 +3894,158 @@
     </w:p>
     <w:p>
       <w:r>
-        <w:t>&lt;&lt; Write here &gt;&gt;</w:t>
+        <w:t>This section presents the experimental progression and refinement process carried out</w:t>
+      </w:r>
+      <w:r>
+        <w:t>.</w:t>
+      </w:r>
+    </w:p>
+    <w:p>
+      <w:pPr>
+        <w:pStyle w:val="Heading1"/>
+      </w:pPr>
+      <w:r>
+        <w:t>7.1 Baseline Experiment</w:t>
+      </w:r>
+    </w:p>
+    <w:p>
+      <w:r>
+        <w:t xml:space="preserve">Before introducing adversarial training, a </w:t>
+      </w:r>
+      <w:r>
+        <w:rPr>
+          <w:b/>
+          <w:bCs/>
+        </w:rPr>
+        <w:t>minimal baseline</w:t>
+      </w:r>
+      <w:r>
+        <w:t xml:space="preserve"> was established using:</w:t>
+      </w:r>
+    </w:p>
+    <w:p>
+      <w:pPr>
+        <w:pStyle w:val="ListParagraph"/>
+        <w:numPr>
+          <w:ilvl w:val="0"/>
+          <w:numId w:val="39"/>
+        </w:numPr>
+      </w:pPr>
+      <w:r>
+        <w:rPr>
+          <w:b/>
+          <w:bCs/>
+        </w:rPr>
+        <w:t>Generator-only</w:t>
+      </w:r>
+      <w:r>
+        <w:t xml:space="preserve"> U-Net</w:t>
+      </w:r>
+    </w:p>
+    <w:p>
+      <w:pPr>
+        <w:pStyle w:val="ListParagraph"/>
+        <w:numPr>
+          <w:ilvl w:val="0"/>
+          <w:numId w:val="39"/>
+        </w:numPr>
+      </w:pPr>
+      <w:r>
+        <w:rPr>
+          <w:b/>
+          <w:bCs/>
+        </w:rPr>
+        <w:t>L1</w:t>
+      </w:r>
+      <w:r>
+        <w:t xml:space="preserve"> reconstruction loss</w:t>
+      </w:r>
+    </w:p>
+    <w:p>
+      <w:pPr>
+        <w:pStyle w:val="ListParagraph"/>
+        <w:numPr>
+          <w:ilvl w:val="0"/>
+          <w:numId w:val="39"/>
+        </w:numPr>
+      </w:pPr>
+      <w:r>
+        <w:t>No discriminator</w:t>
+      </w:r>
+    </w:p>
+    <w:p>
+      <w:r>
+        <w:t xml:space="preserve">This experiment verified correct </w:t>
+      </w:r>
+      <w:r>
+        <w:rPr>
+          <w:b/>
+          <w:bCs/>
+        </w:rPr>
+        <w:t>data loading</w:t>
+      </w:r>
+      <w:r>
+        <w:t xml:space="preserve">, </w:t>
+      </w:r>
+      <w:r>
+        <w:rPr>
+          <w:b/>
+          <w:bCs/>
+        </w:rPr>
+        <w:t>loss computation</w:t>
+      </w:r>
+      <w:r>
+        <w:t xml:space="preserve">, and </w:t>
+      </w:r>
+      <w:r>
+        <w:rPr>
+          <w:b/>
+          <w:bCs/>
+        </w:rPr>
+        <w:t>metric evaluation</w:t>
+      </w:r>
+      <w:r>
+        <w:t xml:space="preserve">, and provided a </w:t>
+      </w:r>
+      <w:r>
+        <w:rPr>
+          <w:b/>
+          <w:bCs/>
+        </w:rPr>
+        <w:t>reference PSNR/SSIM</w:t>
+      </w:r>
+      <w:r>
+        <w:t xml:space="preserve"> for later GAN-based models.</w:t>
+      </w:r>
+    </w:p>
+    <w:p>
+      <w:r>
+        <w:t>Result:</w:t>
+      </w:r>
+      <w:r>
+        <w:t xml:space="preserve"> </w:t>
+      </w:r>
+      <w:r>
+        <w:t>SSIM ≈ 0.48, PSNR ≈ 18.4</w:t>
+      </w:r>
+    </w:p>
+    <w:p>
+      <w:r>
+        <w:lastRenderedPageBreak/>
+        <w:t>This baseline served as a critical comparison point for all subsequent experiments.</w:t>
+      </w:r>
+    </w:p>
+    <w:p>
+      <w:r>
+        <w:t xml:space="preserve">Reference: </w:t>
+      </w:r>
+      <w:r>
+        <w:rPr>
+          <w:b/>
+          <w:bCs/>
+          <w:u w:val="single"/>
+        </w:rPr>
+        <w:t>./results/logs/baseline/train.log</w:t>
       </w:r>
       <w:r>
         <w:br/>
@@ -3875,12 +4056,558 @@
         <w:pStyle w:val="Heading1"/>
       </w:pPr>
       <w:r>
+        <w:t>7.2</w:t>
+      </w:r>
+      <w:r>
+        <w:t xml:space="preserve"> pix2pix GAN Experiments</w:t>
+      </w:r>
+    </w:p>
+    <w:p>
+      <w:r>
+        <w:t xml:space="preserve">After validating the pipeline, a full pix2pix </w:t>
+      </w:r>
+      <w:proofErr w:type="spellStart"/>
+      <w:r>
+        <w:t>cGAN</w:t>
+      </w:r>
+      <w:proofErr w:type="spellEnd"/>
+      <w:r>
+        <w:t xml:space="preserve"> was implemented using a U-Net generator and </w:t>
+      </w:r>
+      <w:proofErr w:type="spellStart"/>
+      <w:r>
+        <w:t>PatchGAN</w:t>
+      </w:r>
+      <w:proofErr w:type="spellEnd"/>
+      <w:r>
+        <w:t xml:space="preserve"> discriminator. A series of controlled experiments (Experiments 0–14) were conducted, each modifying one major factor at a time.</w:t>
+      </w:r>
+    </w:p>
+    <w:p>
+      <w:r>
+        <w:t>For better seeing the refinement process you could visit the refinement.log and train.log files which are complete. I have brought a summary of it in the report.</w:t>
+      </w:r>
+    </w:p>
+    <w:p>
+      <w:pPr>
+        <w:ind w:firstLine="720"/>
+      </w:pPr>
+      <w:r>
+        <w:t>7.2.1 Loss Function Refinement</w:t>
+      </w:r>
+    </w:p>
+    <w:p>
+      <w:pPr>
+        <w:ind w:left="720"/>
+      </w:pPr>
+      <w:r>
+        <w:t>Adjusting adversarial vs. L1 loss weights showed that over-emphasizing the adversarial loss led to unstable training and degraded SSIM.</w:t>
+      </w:r>
+    </w:p>
+    <w:p>
+      <w:pPr>
+        <w:ind w:left="720"/>
+      </w:pPr>
+      <w:r>
+        <w:t>Increasing L1 weight and reducing adversarial weight improved structural consistency and training stability.</w:t>
+      </w:r>
+    </w:p>
+    <w:p>
+      <w:pPr>
+        <w:ind w:left="720"/>
+      </w:pPr>
+      <w:r>
+        <w:t>Adding SSIM directly to the loss yielded improvements.</w:t>
+      </w:r>
+    </w:p>
+    <w:p/>
+    <w:p>
+      <w:pPr>
+        <w:ind w:firstLine="720"/>
+      </w:pPr>
+      <w:r>
+        <w:t>7.2.2 Architecture Experiments</w:t>
+      </w:r>
+    </w:p>
+    <w:p>
+      <w:pPr>
+        <w:ind w:left="720"/>
+      </w:pPr>
+      <w:r>
+        <w:rPr>
+          <w:rFonts w:hint="eastAsia"/>
+        </w:rPr>
+        <w:t xml:space="preserve">Increasing generator capacity (base filters 32 </w:t>
+      </w:r>
+      <w:r>
+        <w:rPr>
+          <w:rFonts w:hint="eastAsia"/>
+        </w:rPr>
+        <w:t>→</w:t>
+      </w:r>
+      <w:r>
+        <w:rPr>
+          <w:rFonts w:hint="eastAsia"/>
+        </w:rPr>
+        <w:t xml:space="preserve"> 64) improved optimization smoothness but did not fundamentally improve structure.</w:t>
+      </w:r>
+    </w:p>
+    <w:p>
+      <w:pPr>
+        <w:ind w:left="720"/>
+      </w:pPr>
+      <w:r>
+        <w:rPr>
+          <w:rFonts w:hint="eastAsia"/>
+        </w:rPr>
+        <w:t xml:space="preserve">Increasing discriminator patch size (16 </w:t>
+      </w:r>
+      <w:r>
+        <w:rPr>
+          <w:rFonts w:hint="eastAsia"/>
+        </w:rPr>
+        <w:t>→</w:t>
+      </w:r>
+      <w:r>
+        <w:rPr>
+          <w:rFonts w:hint="eastAsia"/>
+        </w:rPr>
+        <w:t xml:space="preserve"> 32) led to noticeably better global structure.</w:t>
+      </w:r>
+    </w:p>
+    <w:p>
+      <w:pPr>
+        <w:ind w:left="720"/>
+      </w:pPr>
+      <w:r>
+        <w:t>Additional generator depth improved visual quality but did not significantly increase SSIM.</w:t>
+      </w:r>
+    </w:p>
+    <w:p/>
+    <w:p>
+      <w:pPr>
+        <w:ind w:firstLine="720"/>
+      </w:pPr>
+      <w:r>
+        <w:t>7.2.3. Training Dynamics</w:t>
+      </w:r>
+    </w:p>
+    <w:p>
+      <w:pPr>
+        <w:ind w:left="720"/>
+      </w:pPr>
+      <w:r>
+        <w:t>Learning rate increases did not help escape local minima.</w:t>
+      </w:r>
+    </w:p>
+    <w:p>
+      <w:pPr>
+        <w:ind w:left="720"/>
+      </w:pPr>
+      <w:r>
+        <w:t>Early stopping based on SSIM prevented overfitting and unstable late-epoch degradation.</w:t>
+      </w:r>
+    </w:p>
+    <w:p>
+      <w:pPr>
+        <w:rPr>
+          <w:b/>
+          <w:bCs/>
+          <w:u w:val="single"/>
+        </w:rPr>
+      </w:pPr>
+      <w:r>
+        <w:t xml:space="preserve">Reference: </w:t>
+      </w:r>
+      <w:r>
+        <w:rPr>
+          <w:b/>
+          <w:bCs/>
+          <w:u w:val="single"/>
+        </w:rPr>
+        <w:t>./results/logs/cgan/train.log</w:t>
+      </w:r>
+      <w:r>
+        <w:t xml:space="preserve"> , </w:t>
+      </w:r>
+      <w:r>
+        <w:rPr>
+          <w:b/>
+          <w:bCs/>
+          <w:u w:val="single"/>
+        </w:rPr>
+        <w:t>./results/logs/refinement.log</w:t>
+      </w:r>
+    </w:p>
+    <w:p>
+      <w:pPr>
+        <w:pStyle w:val="Heading1"/>
+      </w:pPr>
+      <w:r>
+        <w:lastRenderedPageBreak/>
+        <w:t>7.3</w:t>
+      </w:r>
+      <w:r>
+        <w:t xml:space="preserve"> Resolution scaling (key improvement)</w:t>
+      </w:r>
+    </w:p>
+    <w:p>
+      <w:r>
+        <w:t>The most significant improvement was achieved by increasing the image resolution:</w:t>
+      </w:r>
+    </w:p>
+    <w:p>
+      <w:r>
+        <w:rPr>
+          <w:rFonts w:hint="eastAsia"/>
+        </w:rPr>
+        <w:t>64</w:t>
+      </w:r>
+      <w:r>
+        <w:rPr>
+          <w:rFonts w:hint="eastAsia"/>
+        </w:rPr>
+        <w:t>×</w:t>
+      </w:r>
+      <w:r>
+        <w:rPr>
+          <w:rFonts w:hint="eastAsia"/>
+        </w:rPr>
+        <w:t xml:space="preserve">64 </w:t>
+      </w:r>
+      <w:r>
+        <w:rPr>
+          <w:rFonts w:hint="eastAsia"/>
+        </w:rPr>
+        <w:t>→</w:t>
+      </w:r>
+      <w:r>
+        <w:rPr>
+          <w:rFonts w:hint="eastAsia"/>
+        </w:rPr>
+        <w:t xml:space="preserve"> 128</w:t>
+      </w:r>
+      <w:r>
+        <w:rPr>
+          <w:rFonts w:hint="eastAsia"/>
+        </w:rPr>
+        <w:t>×</w:t>
+      </w:r>
+      <w:r>
+        <w:rPr>
+          <w:rFonts w:hint="eastAsia"/>
+        </w:rPr>
+        <w:t>128</w:t>
+      </w:r>
+    </w:p>
+    <w:p>
+      <w:r>
+        <w:t>Original learning rates restored</w:t>
+      </w:r>
+      <w:r>
+        <w:t>. Depth of the architecture only in the decoder section increased.</w:t>
+      </w:r>
+    </w:p>
+    <w:p>
+      <w:r>
+        <w:t>This change substantially improved both visual quality and quantitative metrics, confirming that resolution was a major limiting factor in earlier experiments.</w:t>
+      </w:r>
+      <w:r>
+        <w:t xml:space="preserve"> </w:t>
+      </w:r>
+    </w:p>
+    <w:p>
+      <w:r>
+        <w:t>Result:</w:t>
+      </w:r>
+      <w:r>
+        <w:t xml:space="preserve"> </w:t>
+      </w:r>
+      <w:r>
+        <w:t>SSIM ≈ 0.65, PSNR ≈ 2</w:t>
+      </w:r>
+      <w:r>
+        <w:t>1</w:t>
+      </w:r>
+      <w:r>
+        <w:t>.3</w:t>
+      </w:r>
+      <w:r>
+        <w:rPr>
+          <w:b/>
+          <w:bCs/>
+          <w:u w:val="single"/>
+        </w:rPr>
+        <w:br/>
+      </w:r>
+    </w:p>
+    <w:p>
+      <w:pPr>
+        <w:pStyle w:val="Heading1"/>
+      </w:pPr>
+      <w:r>
         <w:t>8. System Design &amp; Code Organization</w:t>
       </w:r>
     </w:p>
     <w:p>
       <w:r>
-        <w:t>&lt;&lt; Write here &gt;&gt;</w:t>
+        <w:t>The system is designed with a modular, production-oriented architecture to clearly separate concerns across data handling, model development, experimentation, evaluation, and deployment. This separation improves reproducibility, maintainability, and extensibility, and reflects real-world machine learning system design rather than notebook-centric experimentation.</w:t>
+      </w:r>
+    </w:p>
+    <w:p>
+      <w:r>
+        <w:t>The overall project structure is shown once below, followed by a functional explanation of each subsystem.</w:t>
+      </w:r>
+    </w:p>
+    <w:p>
+      <w:r>
+        <w:t>satellite2map_cgan/</w:t>
+      </w:r>
+    </w:p>
+    <w:p>
+      <w:r>
+        <w:rPr>
+          <w:rFonts w:hint="eastAsia"/>
+        </w:rPr>
+        <w:t>├──</w:t>
+      </w:r>
+      <w:r>
+        <w:rPr>
+          <w:rFonts w:hint="eastAsia"/>
+        </w:rPr>
+        <w:t xml:space="preserve"> models/</w:t>
+      </w:r>
+    </w:p>
+    <w:p>
+      <w:r>
+        <w:rPr>
+          <w:rFonts w:hint="eastAsia"/>
+        </w:rPr>
+        <w:t>├──</w:t>
+      </w:r>
+      <w:r>
+        <w:rPr>
+          <w:rFonts w:hint="eastAsia"/>
+        </w:rPr>
+        <w:t xml:space="preserve"> training/</w:t>
+      </w:r>
+    </w:p>
+    <w:p>
+      <w:r>
+        <w:rPr>
+          <w:rFonts w:hint="eastAsia"/>
+        </w:rPr>
+        <w:t>├──</w:t>
+      </w:r>
+      <w:r>
+        <w:rPr>
+          <w:rFonts w:hint="eastAsia"/>
+        </w:rPr>
+        <w:t xml:space="preserve"> evaluation/</w:t>
+      </w:r>
+    </w:p>
+    <w:p>
+      <w:r>
+        <w:rPr>
+          <w:rFonts w:hint="eastAsia"/>
+        </w:rPr>
+        <w:t>├──</w:t>
+      </w:r>
+      <w:r>
+        <w:rPr>
+          <w:rFonts w:hint="eastAsia"/>
+        </w:rPr>
+        <w:t xml:space="preserve"> preprocessing/</w:t>
+      </w:r>
+    </w:p>
+    <w:p>
+      <w:r>
+        <w:rPr>
+          <w:rFonts w:hint="eastAsia"/>
+        </w:rPr>
+        <w:t>├──</w:t>
+      </w:r>
+      <w:r>
+        <w:rPr>
+          <w:rFonts w:hint="eastAsia"/>
+        </w:rPr>
+        <w:t xml:space="preserve"> postprocessing/</w:t>
+      </w:r>
+    </w:p>
+    <w:p>
+      <w:r>
+        <w:rPr>
+          <w:rFonts w:hint="eastAsia"/>
+        </w:rPr>
+        <w:t>├──</w:t>
+      </w:r>
+      <w:r>
+        <w:rPr>
+          <w:rFonts w:hint="eastAsia"/>
+        </w:rPr>
+        <w:t xml:space="preserve"> utils/</w:t>
+      </w:r>
+    </w:p>
+    <w:p>
+      <w:r>
+        <w:rPr>
+          <w:rFonts w:hint="eastAsia"/>
+        </w:rPr>
+        <w:t>├──</w:t>
+      </w:r>
+      <w:r>
+        <w:rPr>
+          <w:rFonts w:hint="eastAsia"/>
+        </w:rPr>
+        <w:t xml:space="preserve"> </w:t>
+      </w:r>
+      <w:proofErr w:type="spellStart"/>
+      <w:r>
+        <w:rPr>
+          <w:rFonts w:hint="eastAsia"/>
+        </w:rPr>
+        <w:t>ui</w:t>
+      </w:r>
+      <w:proofErr w:type="spellEnd"/>
+      <w:r>
+        <w:rPr>
+          <w:rFonts w:hint="eastAsia"/>
+        </w:rPr>
+        <w:t>/</w:t>
+      </w:r>
+    </w:p>
+    <w:p>
+      <w:r>
+        <w:rPr>
+          <w:rFonts w:hint="eastAsia"/>
+        </w:rPr>
+        <w:t>├──</w:t>
+      </w:r>
+      <w:r>
+        <w:rPr>
+          <w:rFonts w:hint="eastAsia"/>
+        </w:rPr>
+        <w:t xml:space="preserve"> data/</w:t>
+      </w:r>
+    </w:p>
+    <w:p>
+      <w:r>
+        <w:rPr>
+          <w:rFonts w:hint="eastAsia"/>
+        </w:rPr>
+        <w:t>├──</w:t>
+      </w:r>
+      <w:r>
+        <w:rPr>
+          <w:rFonts w:hint="eastAsia"/>
+        </w:rPr>
+        <w:t xml:space="preserve"> results/</w:t>
+      </w:r>
+    </w:p>
+    <w:p>
+      <w:r>
+        <w:rPr>
+          <w:rFonts w:hint="eastAsia"/>
+        </w:rPr>
+        <w:t>├──</w:t>
+      </w:r>
+      <w:r>
+        <w:rPr>
+          <w:rFonts w:hint="eastAsia"/>
+        </w:rPr>
+        <w:t xml:space="preserve"> notebooks/</w:t>
+      </w:r>
+    </w:p>
+    <w:p>
+      <w:r>
+        <w:rPr>
+          <w:rFonts w:hint="eastAsia"/>
+        </w:rPr>
+        <w:lastRenderedPageBreak/>
+        <w:t>├──</w:t>
+      </w:r>
+      <w:r>
+        <w:rPr>
+          <w:rFonts w:hint="eastAsia"/>
+        </w:rPr>
+        <w:t xml:space="preserve"> configs/</w:t>
+      </w:r>
+    </w:p>
+    <w:p>
+      <w:r>
+        <w:rPr>
+          <w:rFonts w:hint="eastAsia"/>
+        </w:rPr>
+        <w:t>├──</w:t>
+      </w:r>
+      <w:r>
+        <w:rPr>
+          <w:rFonts w:hint="eastAsia"/>
+        </w:rPr>
+        <w:t xml:space="preserve"> tests/</w:t>
+      </w:r>
+    </w:p>
+    <w:p>
+      <w:pPr>
+        <w:pStyle w:val="Heading1"/>
+      </w:pPr>
+      <w:r>
+        <w:t>8.1 Models</w:t>
+      </w:r>
+    </w:p>
+    <w:p>
+      <w:r>
+        <w:t xml:space="preserve">The </w:t>
+      </w:r>
+      <w:r>
+        <w:rPr>
+          <w:i/>
+          <w:iCs/>
+        </w:rPr>
+        <w:t>models/</w:t>
+      </w:r>
+      <w:r>
+        <w:t xml:space="preserve"> directory contains pure </w:t>
+      </w:r>
+      <w:r>
+        <w:rPr>
+          <w:b/>
+          <w:bCs/>
+        </w:rPr>
+        <w:t>architectural</w:t>
+      </w:r>
+      <w:r>
+        <w:t xml:space="preserve"> definitions for the </w:t>
+      </w:r>
+      <w:r>
+        <w:rPr>
+          <w:b/>
+          <w:bCs/>
+        </w:rPr>
+        <w:t>generator</w:t>
+      </w:r>
+      <w:r>
+        <w:t xml:space="preserve"> and </w:t>
+      </w:r>
+      <w:r>
+        <w:rPr>
+          <w:b/>
+          <w:bCs/>
+        </w:rPr>
+        <w:t>discriminator</w:t>
+      </w:r>
+      <w:r>
+        <w:t xml:space="preserve">. These files are intentionally kept free of training logic, data loading, or evaluation code. This design allows the same model definitions to be reused across baseline training, full GAN training, evaluation, and UI inference without duplication or side effects. </w:t>
+      </w:r>
+      <w:r>
+        <w:rPr>
+          <w:b/>
+          <w:bCs/>
+        </w:rPr>
+        <w:t>Pretrained weights</w:t>
+      </w:r>
+      <w:r>
+        <w:t xml:space="preserve"> are isolated to ensure clean versioning and controlled reuse.</w:t>
       </w:r>
       <w:r>
         <w:br/>
@@ -3891,12 +4618,378 @@
         <w:pStyle w:val="Heading1"/>
       </w:pPr>
       <w:r>
+        <w:t>8.2 Training</w:t>
+      </w:r>
+    </w:p>
+    <w:p>
+      <w:r>
+        <w:t xml:space="preserve">The </w:t>
+      </w:r>
+      <w:r>
+        <w:rPr>
+          <w:i/>
+          <w:iCs/>
+        </w:rPr>
+        <w:t>training/</w:t>
+      </w:r>
+      <w:r>
+        <w:t xml:space="preserve"> module encapsulates all </w:t>
+      </w:r>
+      <w:r>
+        <w:rPr>
+          <w:b/>
+          <w:bCs/>
+        </w:rPr>
+        <w:t>learning-time logic</w:t>
+      </w:r>
+      <w:r>
+        <w:t xml:space="preserve">, including optimization, loss composition, and training loops. </w:t>
+      </w:r>
+      <w:r>
+        <w:rPr>
+          <w:b/>
+          <w:bCs/>
+        </w:rPr>
+        <w:t>Baseline</w:t>
+      </w:r>
+      <w:r>
+        <w:t xml:space="preserve"> training (generator-only with L1 loss) is explicitly separated from </w:t>
+      </w:r>
+      <w:r>
+        <w:rPr>
+          <w:b/>
+          <w:bCs/>
+        </w:rPr>
+        <w:t xml:space="preserve">full </w:t>
+      </w:r>
+      <w:proofErr w:type="spellStart"/>
+      <w:r>
+        <w:rPr>
+          <w:b/>
+          <w:bCs/>
+        </w:rPr>
+        <w:t>cGAN</w:t>
+      </w:r>
+      <w:proofErr w:type="spellEnd"/>
+      <w:r>
+        <w:t xml:space="preserve"> training to enforce experimental clarity and to support staged validation of model behavior. This separation prevents tightly coupled scripts and allows controlled comparison between training strategies.</w:t>
+      </w:r>
+    </w:p>
+    <w:p>
+      <w:pPr>
+        <w:pStyle w:val="Heading1"/>
+      </w:pPr>
+      <w:r>
+        <w:t>8.3 Evaluation</w:t>
+      </w:r>
+    </w:p>
+    <w:p>
+      <w:r>
+        <w:t xml:space="preserve">All </w:t>
+      </w:r>
+      <w:r>
+        <w:rPr>
+          <w:b/>
+          <w:bCs/>
+        </w:rPr>
+        <w:t>quantitative</w:t>
+      </w:r>
+      <w:r>
+        <w:t xml:space="preserve"> and </w:t>
+      </w:r>
+      <w:r>
+        <w:rPr>
+          <w:b/>
+          <w:bCs/>
+        </w:rPr>
+        <w:t>qualitative</w:t>
+      </w:r>
+      <w:r>
+        <w:t xml:space="preserve"> assessment logic is centralized under </w:t>
+      </w:r>
+      <w:r>
+        <w:rPr>
+          <w:i/>
+          <w:iCs/>
+        </w:rPr>
+        <w:t>evaluation/.</w:t>
+      </w:r>
+      <w:r>
+        <w:t xml:space="preserve"> Metric computation (</w:t>
+      </w:r>
+      <w:r>
+        <w:rPr>
+          <w:b/>
+          <w:bCs/>
+        </w:rPr>
+        <w:t>PSNR</w:t>
+      </w:r>
+      <w:r>
+        <w:t xml:space="preserve">, </w:t>
+      </w:r>
+      <w:r>
+        <w:rPr>
+          <w:b/>
+          <w:bCs/>
+        </w:rPr>
+        <w:t>SSIM</w:t>
+      </w:r>
+      <w:r>
+        <w:t xml:space="preserve">) and </w:t>
+      </w:r>
+      <w:r>
+        <w:rPr>
+          <w:b/>
+          <w:bCs/>
+        </w:rPr>
+        <w:t>visualization</w:t>
+      </w:r>
+      <w:r>
+        <w:t xml:space="preserve"> are decoupled from training to guarantee that evaluation remains consistent across experiments. This ensures that reported metrics are computed on </w:t>
+      </w:r>
+      <w:r>
+        <w:rPr>
+          <w:b/>
+          <w:bCs/>
+        </w:rPr>
+        <w:t>raw model outputs</w:t>
+      </w:r>
+      <w:r>
+        <w:t xml:space="preserve"> and not influenced by training-time artifacts or UI-specific processing.</w:t>
+      </w:r>
+    </w:p>
+    <w:p>
+      <w:pPr>
+        <w:pStyle w:val="Heading1"/>
+      </w:pPr>
+      <w:r>
+        <w:t>8.4 Pre-Processing &amp; Post-Processing</w:t>
+      </w:r>
+    </w:p>
+    <w:p>
+      <w:r>
+        <w:t>Data preparation (</w:t>
+      </w:r>
+      <w:r>
+        <w:rPr>
+          <w:i/>
+          <w:iCs/>
+        </w:rPr>
+        <w:t>preprocessing/</w:t>
+      </w:r>
+      <w:r>
+        <w:t>) and output enhancement (</w:t>
+      </w:r>
+      <w:r>
+        <w:rPr>
+          <w:i/>
+          <w:iCs/>
+        </w:rPr>
+        <w:t>postprocessing/</w:t>
+      </w:r>
+      <w:r>
+        <w:t xml:space="preserve">) are treated as independent stages outside the learning pipeline. </w:t>
+      </w:r>
+      <w:r>
+        <w:rPr>
+          <w:b/>
+          <w:bCs/>
+        </w:rPr>
+        <w:t>Preprocessing</w:t>
+      </w:r>
+      <w:r>
+        <w:t xml:space="preserve"> standardizes input format and normalization, while </w:t>
+      </w:r>
+      <w:r>
+        <w:rPr>
+          <w:b/>
+          <w:bCs/>
+        </w:rPr>
+        <w:t>postprocessing</w:t>
+      </w:r>
+      <w:r>
+        <w:t xml:space="preserve"> is used strictly for visualization and user-facing results. Importantly, evaluation metrics are computed before postprocessing, preserving the scientific validity of quantitative results.</w:t>
+      </w:r>
+    </w:p>
+    <w:p>
+      <w:pPr>
+        <w:pStyle w:val="Heading1"/>
+      </w:pPr>
+      <w:r>
+        <w:t xml:space="preserve">8.5 </w:t>
+      </w:r>
+      <w:r>
+        <w:t>Utilities</w:t>
+      </w:r>
+    </w:p>
+    <w:p>
+      <w:r>
+        <w:t xml:space="preserve">The </w:t>
+      </w:r>
+      <w:r>
+        <w:rPr>
+          <w:i/>
+          <w:iCs/>
+        </w:rPr>
+        <w:t>utils/</w:t>
+      </w:r>
+      <w:r>
+        <w:t xml:space="preserve"> directory contains shared infrastructure such as </w:t>
+      </w:r>
+      <w:proofErr w:type="spellStart"/>
+      <w:r>
+        <w:rPr>
+          <w:b/>
+          <w:bCs/>
+        </w:rPr>
+        <w:t>dataloaders</w:t>
+      </w:r>
+      <w:proofErr w:type="spellEnd"/>
+      <w:r>
+        <w:t xml:space="preserve"> and </w:t>
+      </w:r>
+      <w:r>
+        <w:rPr>
+          <w:b/>
+          <w:bCs/>
+        </w:rPr>
+        <w:t>helper</w:t>
+      </w:r>
+      <w:r>
+        <w:t xml:space="preserve"> functions. This avoids code duplication across training, evaluation, and UI layers, and enforces consistent data handling throughout the system.</w:t>
+      </w:r>
+    </w:p>
+    <w:p>
+      <w:pPr>
+        <w:pStyle w:val="Heading1"/>
+      </w:pPr>
+      <w:r>
+        <w:lastRenderedPageBreak/>
+        <w:t>8.6 Supporting Structure</w:t>
+      </w:r>
+    </w:p>
+    <w:p>
+      <w:r>
+        <w:rPr>
+          <w:b/>
+          <w:bCs/>
+        </w:rPr>
+        <w:t xml:space="preserve">Configuration </w:t>
+      </w:r>
+      <w:r>
+        <w:t xml:space="preserve">files, </w:t>
+      </w:r>
+      <w:r>
+        <w:rPr>
+          <w:b/>
+          <w:bCs/>
+        </w:rPr>
+        <w:t>results</w:t>
+      </w:r>
+      <w:r>
+        <w:t xml:space="preserve">, </w:t>
+      </w:r>
+      <w:r>
+        <w:rPr>
+          <w:b/>
+          <w:bCs/>
+        </w:rPr>
+        <w:t>notebooks</w:t>
+      </w:r>
+      <w:r>
+        <w:t xml:space="preserve">, and </w:t>
+      </w:r>
+      <w:r>
+        <w:rPr>
+          <w:b/>
+          <w:bCs/>
+        </w:rPr>
+        <w:t>tests</w:t>
+      </w:r>
+      <w:r>
+        <w:t xml:space="preserve"> are isolated into dedicated directories. </w:t>
+      </w:r>
+      <w:r>
+        <w:rPr>
+          <w:b/>
+          <w:bCs/>
+        </w:rPr>
+        <w:t>Notebooks</w:t>
+      </w:r>
+      <w:r>
+        <w:t xml:space="preserve"> are used only for </w:t>
+      </w:r>
+      <w:r>
+        <w:rPr>
+          <w:b/>
+          <w:bCs/>
+        </w:rPr>
+        <w:t>exploratory analysis</w:t>
+      </w:r>
+      <w:r>
+        <w:t xml:space="preserve"> and </w:t>
+      </w:r>
+      <w:r>
+        <w:rPr>
+          <w:b/>
+          <w:bCs/>
+        </w:rPr>
+        <w:t>reporting</w:t>
+      </w:r>
+      <w:r>
+        <w:t>, while the core system remains script- and module-driven. This separation reinforces reproducibility and prevents experimental artifacts from contaminating the main codebase.</w:t>
+      </w:r>
+    </w:p>
+    <w:p>
+      <w:pPr>
+        <w:pStyle w:val="Heading1"/>
+      </w:pPr>
+      <w:r>
         <w:t>9. UI &amp; Deployment</w:t>
       </w:r>
     </w:p>
     <w:p>
       <w:r>
-        <w:t>&lt;&lt; Write here &gt;&gt;</w:t>
+        <w:t xml:space="preserve">The </w:t>
+      </w:r>
+      <w:proofErr w:type="spellStart"/>
+      <w:r>
+        <w:t>ui</w:t>
+      </w:r>
+      <w:proofErr w:type="spellEnd"/>
+      <w:r>
+        <w:t>/ module provides an interactive interface (</w:t>
+      </w:r>
+      <w:proofErr w:type="spellStart"/>
+      <w:r>
+        <w:t>Gradio</w:t>
+      </w:r>
+      <w:proofErr w:type="spellEnd"/>
+      <w:r>
+        <w:t>-based) that consumes trained models as black-box components. It interacts with models and postprocessing utilities but does not perform training or evaluation. This strict boundary ensures that deployment logic does not leak into experimental code, aligning with production ML practices.</w:t>
+      </w:r>
+    </w:p>
+    <w:p>
+      <w:r>
+        <w:t xml:space="preserve">In addition to the </w:t>
+      </w:r>
+      <w:proofErr w:type="spellStart"/>
+      <w:r>
+        <w:t>Gradio</w:t>
+      </w:r>
+      <w:proofErr w:type="spellEnd"/>
+      <w:r>
+        <w:t xml:space="preserve"> demo, a Flask-based web interface is implemented to emulate a realistic deployment setup. The Flask backend serves as a lightweight inference service, exposing trained models through defined routes and treating them strictly as black-box components.</w:t>
+      </w:r>
+    </w:p>
+    <w:p>
+      <w:r>
+        <w:t>The frontend, built with HTML, CSS, and JavaScript, manages image upload, user interaction, and result visualization, while all inference and postprocessing remain in the backend. No training or evaluation logic is included in the UI layer.</w:t>
+      </w:r>
+    </w:p>
+    <w:p>
+      <w:r>
+        <w:t>This separation reflects common production ML architectures, ensuring clean boundaries between model execution and presentation logic, and supporting maintainability and future deployment extensions.</w:t>
       </w:r>
       <w:r>
         <w:br/>
@@ -3911,8 +5004,369 @@
       </w:r>
     </w:p>
     <w:p>
-      <w:r>
-        <w:t>&lt;&lt; Write here &gt;&gt;</w:t>
+      <w:pPr>
+        <w:pStyle w:val="ListParagraph"/>
+        <w:numPr>
+          <w:ilvl w:val="0"/>
+          <w:numId w:val="40"/>
+        </w:numPr>
+      </w:pPr>
+      <w:r>
+        <w:t xml:space="preserve">A </w:t>
+      </w:r>
+      <w:r>
+        <w:rPr>
+          <w:b/>
+          <w:bCs/>
+        </w:rPr>
+        <w:t>primary limitation</w:t>
+      </w:r>
+      <w:r>
+        <w:t xml:space="preserve"> of this project is the </w:t>
+      </w:r>
+      <w:r>
+        <w:rPr>
+          <w:b/>
+          <w:bCs/>
+        </w:rPr>
+        <w:t>dataset size</w:t>
+      </w:r>
+      <w:r>
+        <w:t xml:space="preserve">, which consists of approximately </w:t>
+      </w:r>
+      <w:r>
+        <w:rPr>
+          <w:b/>
+          <w:bCs/>
+        </w:rPr>
+        <w:t>1,500 paired satellite–map</w:t>
+      </w:r>
+      <w:r>
+        <w:t xml:space="preserve"> </w:t>
+      </w:r>
+      <w:r>
+        <w:rPr>
+          <w:b/>
+          <w:bCs/>
+        </w:rPr>
+        <w:t>images</w:t>
+      </w:r>
+      <w:r>
+        <w:t xml:space="preserve">. While sufficient for prototyping and controlled experimentation, this scale limits the model’s ability to </w:t>
+      </w:r>
+      <w:r>
+        <w:rPr>
+          <w:b/>
+          <w:bCs/>
+        </w:rPr>
+        <w:t>generalize</w:t>
+      </w:r>
+      <w:r>
+        <w:t xml:space="preserve"> to more diverse geographic patterns and fine-grained structures.</w:t>
+      </w:r>
+    </w:p>
+    <w:p>
+      <w:pPr>
+        <w:pStyle w:val="ListParagraph"/>
+      </w:pPr>
+    </w:p>
+    <w:p>
+      <w:pPr>
+        <w:pStyle w:val="ListParagraph"/>
+        <w:numPr>
+          <w:ilvl w:val="0"/>
+          <w:numId w:val="40"/>
+        </w:numPr>
+      </w:pPr>
+      <w:r>
+        <w:rPr>
+          <w:b/>
+          <w:bCs/>
+        </w:rPr>
+        <w:t>Computational constraints</w:t>
+      </w:r>
+      <w:r>
+        <w:t xml:space="preserve"> significantly influenced design decisions. Due to the </w:t>
+      </w:r>
+      <w:r>
+        <w:rPr>
+          <w:b/>
+          <w:bCs/>
+        </w:rPr>
+        <w:t>lack</w:t>
+      </w:r>
+      <w:r>
+        <w:t xml:space="preserve"> of access to a </w:t>
+      </w:r>
+      <w:r>
+        <w:rPr>
+          <w:b/>
+          <w:bCs/>
+        </w:rPr>
+        <w:t>local GPU</w:t>
+      </w:r>
+      <w:r>
+        <w:t xml:space="preserve"> and </w:t>
+      </w:r>
+      <w:r>
+        <w:rPr>
+          <w:b/>
+          <w:bCs/>
+        </w:rPr>
+        <w:t>restricted</w:t>
+      </w:r>
+      <w:r>
+        <w:t xml:space="preserve"> availability of </w:t>
+      </w:r>
+      <w:r>
+        <w:rPr>
+          <w:b/>
+          <w:bCs/>
+        </w:rPr>
+        <w:t>cloud GPU</w:t>
+      </w:r>
+      <w:r>
+        <w:t xml:space="preserve"> resources, most experiments were conducted on limited hardware. As a result, images were initially </w:t>
+      </w:r>
+      <w:r>
+        <w:rPr>
+          <w:b/>
+          <w:bCs/>
+        </w:rPr>
+        <w:t>downscaled</w:t>
+      </w:r>
+      <w:r>
+        <w:t xml:space="preserve"> to </w:t>
+      </w:r>
+      <w:r>
+        <w:rPr>
+          <w:b/>
+          <w:bCs/>
+        </w:rPr>
+        <w:t>64×64</w:t>
+      </w:r>
+      <w:r>
+        <w:t xml:space="preserve"> for rapid iteration and stability testing. Later experiments were extended to </w:t>
+      </w:r>
+      <w:r>
+        <w:rPr>
+          <w:b/>
+          <w:bCs/>
+        </w:rPr>
+        <w:t>128×128</w:t>
+      </w:r>
+      <w:r>
+        <w:t xml:space="preserve">, which, while an improvement, remains far below the original 600×600 resolution and the </w:t>
+      </w:r>
+      <w:r>
+        <w:rPr>
+          <w:b/>
+          <w:bCs/>
+        </w:rPr>
+        <w:t>ideal 512×512</w:t>
+      </w:r>
+      <w:r>
+        <w:t xml:space="preserve"> commonly used in high-fidelity image translation tasks. This resolution reduction directly impacts sharpness and fine structural detail.</w:t>
+      </w:r>
+    </w:p>
+    <w:p>
+      <w:pPr>
+        <w:pStyle w:val="ListParagraph"/>
+      </w:pPr>
+    </w:p>
+    <w:p>
+      <w:pPr>
+        <w:pStyle w:val="ListParagraph"/>
+        <w:numPr>
+          <w:ilvl w:val="0"/>
+          <w:numId w:val="40"/>
+        </w:numPr>
+      </w:pPr>
+      <w:r>
+        <w:lastRenderedPageBreak/>
+        <w:t xml:space="preserve">Another challenge involved </w:t>
+      </w:r>
+      <w:r>
+        <w:rPr>
+          <w:b/>
+          <w:bCs/>
+        </w:rPr>
+        <w:t>GAN training instability</w:t>
+      </w:r>
+      <w:r>
+        <w:t xml:space="preserve"> and </w:t>
+      </w:r>
+      <w:r>
+        <w:rPr>
+          <w:b/>
+          <w:bCs/>
+        </w:rPr>
+        <w:t>architectural trade-offs</w:t>
+      </w:r>
+      <w:r>
+        <w:t xml:space="preserve">. Although the </w:t>
+      </w:r>
+      <w:r>
+        <w:rPr>
+          <w:b/>
+          <w:bCs/>
+        </w:rPr>
+        <w:t>pix2pix framework</w:t>
+      </w:r>
+      <w:r>
+        <w:t xml:space="preserve"> is well-documented in literature, </w:t>
+      </w:r>
+      <w:r>
+        <w:rPr>
+          <w:b/>
+          <w:bCs/>
+        </w:rPr>
+        <w:t>practical constraints</w:t>
+      </w:r>
+      <w:r>
+        <w:t xml:space="preserve"> (data scale, resolution, and training time) required deviations from the original setup. Under these conditions, determining how </w:t>
+      </w:r>
+      <w:r>
+        <w:rPr>
+          <w:b/>
+          <w:bCs/>
+        </w:rPr>
+        <w:t>far performance</w:t>
+      </w:r>
+      <w:r>
+        <w:t xml:space="preserve"> could be improved without </w:t>
+      </w:r>
+      <w:r>
+        <w:rPr>
+          <w:b/>
+          <w:bCs/>
+        </w:rPr>
+        <w:t>overfitting</w:t>
+      </w:r>
+      <w:r>
+        <w:t xml:space="preserve"> or </w:t>
+      </w:r>
+      <w:r>
+        <w:rPr>
+          <w:b/>
+          <w:bCs/>
+        </w:rPr>
+        <w:t>instability</w:t>
+      </w:r>
+      <w:r>
+        <w:t xml:space="preserve"> was non-trivial, especially under strict time constraints.</w:t>
+      </w:r>
+    </w:p>
+    <w:p>
+      <w:pPr>
+        <w:pStyle w:val="ListParagraph"/>
+      </w:pPr>
+    </w:p>
+    <w:p>
+      <w:pPr>
+        <w:pStyle w:val="ListParagraph"/>
+        <w:numPr>
+          <w:ilvl w:val="0"/>
+          <w:numId w:val="40"/>
+        </w:numPr>
+      </w:pPr>
+      <w:r>
+        <w:t xml:space="preserve">From a modeling perspective, a </w:t>
+      </w:r>
+      <w:r>
+        <w:rPr>
+          <w:b/>
+          <w:bCs/>
+        </w:rPr>
+        <w:t>persistent sharpness</w:t>
+      </w:r>
+      <w:r>
+        <w:t xml:space="preserve"> versus </w:t>
+      </w:r>
+      <w:r>
+        <w:rPr>
+          <w:b/>
+          <w:bCs/>
+        </w:rPr>
+        <w:t>structural consistency</w:t>
+      </w:r>
+      <w:r>
+        <w:t xml:space="preserve"> trade-off was observed. Increasing </w:t>
+      </w:r>
+      <w:r>
+        <w:rPr>
+          <w:b/>
+          <w:bCs/>
+        </w:rPr>
+        <w:t>adversarial</w:t>
+      </w:r>
+      <w:r>
+        <w:t xml:space="preserve"> influence improved visual </w:t>
+      </w:r>
+      <w:r>
+        <w:rPr>
+          <w:b/>
+          <w:bCs/>
+        </w:rPr>
+        <w:t>sharpness</w:t>
+      </w:r>
+      <w:r>
+        <w:t xml:space="preserve"> but risked introducing </w:t>
+      </w:r>
+      <w:r>
+        <w:rPr>
+          <w:b/>
+          <w:bCs/>
+        </w:rPr>
+        <w:t>artifacts</w:t>
+      </w:r>
+      <w:r>
+        <w:t xml:space="preserve">, while stronger </w:t>
+      </w:r>
+      <w:r>
+        <w:rPr>
+          <w:b/>
+          <w:bCs/>
+        </w:rPr>
+        <w:t>reconstruction</w:t>
+      </w:r>
+      <w:r>
+        <w:t xml:space="preserve"> losses preserved </w:t>
+      </w:r>
+      <w:r>
+        <w:rPr>
+          <w:b/>
+          <w:bCs/>
+        </w:rPr>
+        <w:t>structure</w:t>
+      </w:r>
+      <w:r>
+        <w:t xml:space="preserve"> at the cost of overly </w:t>
+      </w:r>
+      <w:r>
+        <w:rPr>
+          <w:b/>
+          <w:bCs/>
+        </w:rPr>
+        <w:t>smooth</w:t>
+      </w:r>
+      <w:r>
+        <w:t xml:space="preserve"> outputs. Balancing these objectives required careful empirical tuning.</w:t>
+      </w:r>
+    </w:p>
+    <w:p>
+      <w:r>
+        <w:t xml:space="preserve">Finally, the project demanded </w:t>
+      </w:r>
+      <w:r>
+        <w:rPr>
+          <w:b/>
+          <w:bCs/>
+        </w:rPr>
+        <w:t>end-to-end system</w:t>
+      </w:r>
+      <w:r>
+        <w:t xml:space="preserve"> engineering, including data pipelines, evaluation tooling, visualization, and UI integration. Ensuring correctness and modularity across all components added complexity beyond model training alone but was necessary to maintain a production-oriented design.</w:t>
       </w:r>
       <w:r>
         <w:br/>
@@ -3928,7 +5382,97 @@
     </w:p>
     <w:p>
       <w:r>
-        <w:t>&lt;&lt; Write here &gt;&gt;</w:t>
+        <w:t>While the current system demonstrates effective satellite-to-map translation using a pix2pix-style Conditional GAN, several extensions can further improve performance, scalability, and applicability in real-world settings.</w:t>
+      </w:r>
+    </w:p>
+    <w:p>
+      <w:r>
+        <w:t xml:space="preserve">First, </w:t>
+      </w:r>
+      <w:r>
+        <w:rPr>
+          <w:b/>
+          <w:bCs/>
+        </w:rPr>
+        <w:t>expanding</w:t>
+      </w:r>
+      <w:r>
+        <w:t xml:space="preserve"> the </w:t>
+      </w:r>
+      <w:r>
+        <w:rPr>
+          <w:b/>
+          <w:bCs/>
+        </w:rPr>
+        <w:t>training dataset</w:t>
+      </w:r>
+      <w:r>
+        <w:t xml:space="preserve"> with larger and more diverse satellite–map pairs would improve generalization across different geographic regions, lighting conditions, and map styles. Increased data diversity is expected to reduce overfitting and improve robustness.</w:t>
+      </w:r>
+    </w:p>
+    <w:p>
+      <w:r>
+        <w:t xml:space="preserve">Second, incorporating a </w:t>
+      </w:r>
+      <w:r>
+        <w:rPr>
+          <w:b/>
+          <w:bCs/>
+        </w:rPr>
+        <w:t>perceptual loss</w:t>
+      </w:r>
+      <w:r>
+        <w:t xml:space="preserve"> based on deep feature representations (e.g., </w:t>
+      </w:r>
+      <w:r>
+        <w:rPr>
+          <w:b/>
+          <w:bCs/>
+        </w:rPr>
+        <w:t>pretrained VGG networks</w:t>
+      </w:r>
+      <w:r>
+        <w:t>) could enhance semantic consistency and visual realism. Unlike pixel-wise losses, perceptual losses better capture high-level structural and textural similarities relevant to human perception.</w:t>
+      </w:r>
+    </w:p>
+    <w:p>
+      <w:r>
+        <w:t xml:space="preserve">Third, adopting a </w:t>
+      </w:r>
+      <w:r>
+        <w:rPr>
+          <w:b/>
+          <w:bCs/>
+        </w:rPr>
+        <w:t>multi-scale discriminator</w:t>
+      </w:r>
+      <w:r>
+        <w:t xml:space="preserve"> architecture could improve both global coherence and local detail. By evaluating generated images at multiple resolutions, the discriminator can enforce realism across different spatial scales, which is particularly beneficial for complex map structures.</w:t>
+      </w:r>
+    </w:p>
+    <w:p>
+      <w:r>
+        <w:t xml:space="preserve">Finally, implementing </w:t>
+      </w:r>
+      <w:r>
+        <w:rPr>
+          <w:b/>
+          <w:bCs/>
+        </w:rPr>
+        <w:t>tile-based high-resolution inference</w:t>
+      </w:r>
+      <w:r>
+        <w:t xml:space="preserve"> would enable the model to scale beyond fixed-size inputs. By processing large satellite images in </w:t>
+      </w:r>
+      <w:r>
+        <w:rPr>
+          <w:b/>
+          <w:bCs/>
+        </w:rPr>
+        <w:t>overlapping tiles</w:t>
+      </w:r>
+      <w:r>
+        <w:t xml:space="preserve"> and seamlessly stitching outputs, the system could support real-world, high-resolution mapping applications.</w:t>
       </w:r>
       <w:r>
         <w:br/>
@@ -3939,15 +5483,56 @@
         <w:pStyle w:val="Heading1"/>
       </w:pPr>
       <w:r>
+        <w:lastRenderedPageBreak/>
         <w:t>12. Conclusion</w:t>
       </w:r>
     </w:p>
     <w:p>
       <w:r>
-        <w:t>&lt;&lt; Write here &gt;&gt;</w:t>
-      </w:r>
-      <w:r>
-        <w:br/>
+        <w:t xml:space="preserve">This project implemented an </w:t>
+      </w:r>
+      <w:r>
+        <w:t>end-to-end</w:t>
+      </w:r>
+      <w:r>
+        <w:rPr>
+          <w:b/>
+          <w:bCs/>
+        </w:rPr>
+        <w:t xml:space="preserve"> satellite-to-map image translation system</w:t>
+      </w:r>
+      <w:r>
+        <w:t xml:space="preserve"> using a </w:t>
+      </w:r>
+      <w:r>
+        <w:rPr>
+          <w:b/>
+          <w:bCs/>
+        </w:rPr>
+        <w:t>pix2pix-based Conditional GAN</w:t>
+      </w:r>
+      <w:r>
+        <w:t>, covering data preprocessing, model design, training, evaluation, and deployment. The system was developed with a modular, production-oriented structure that separates experimentation, evaluation, and user interaction.</w:t>
+      </w:r>
+    </w:p>
+    <w:p>
+      <w:r>
+        <w:t>The approach works by leveraging paired supervision, adversarial learning, and reconstruction-based losses to preserve spatial structure while translating visual semantics from satellite imagery to map-style representations. Quantitative metrics (PSNR and SSIM) and qualitative analysis confirm that the model learns meaningful and spatially consistent mappings despite data and computational constraints.</w:t>
+      </w:r>
+    </w:p>
+    <w:p>
+      <w:r>
+        <w:t xml:space="preserve">This work demonstrates the practical applicability of conditional GANs in </w:t>
+      </w:r>
+      <w:r>
+        <w:rPr>
+          <w:b/>
+          <w:bCs/>
+        </w:rPr>
+        <w:t>remote sensing and geospatial visualization</w:t>
+      </w:r>
+      <w:r>
+        <w:t>, while also highlighting the importance of system design, reproducibility, and engineering discipline in applied machine learning projects. The project provides a strong foundation for future extensions toward higher resolutions, larger datasets, and real-world deployment scenarios.</w:t>
       </w:r>
     </w:p>
     <w:p>
@@ -3955,16 +5540,106 @@
         <w:pStyle w:val="Heading1"/>
       </w:pPr>
       <w:r>
-        <w:lastRenderedPageBreak/>
         <w:t>13. References</w:t>
       </w:r>
     </w:p>
     <w:p>
       <w:r>
-        <w:t>&lt;&lt; Write here &gt;&gt;</w:t>
-      </w:r>
-      <w:r>
-        <w:br/>
+        <w:t xml:space="preserve">[1] P. Isola, J.-Y. Zhu, T. Zhou, and A. A. </w:t>
+      </w:r>
+      <w:proofErr w:type="spellStart"/>
+      <w:r>
+        <w:t>Efros</w:t>
+      </w:r>
+      <w:proofErr w:type="spellEnd"/>
+      <w:r>
+        <w:t>, Image-to-Image Translation with Conditional Adversarial Networks, CVPR, 2017.</w:t>
+      </w:r>
+    </w:p>
+    <w:p>
+      <w:r>
+        <w:t xml:space="preserve">[2] Z. Wang, A. C. </w:t>
+      </w:r>
+      <w:proofErr w:type="spellStart"/>
+      <w:r>
+        <w:t>Bovik</w:t>
+      </w:r>
+      <w:proofErr w:type="spellEnd"/>
+      <w:r>
+        <w:t xml:space="preserve">, H. R. Sheikh, and E. P. </w:t>
+      </w:r>
+      <w:proofErr w:type="spellStart"/>
+      <w:r>
+        <w:t>Simoncelli</w:t>
+      </w:r>
+      <w:proofErr w:type="spellEnd"/>
+      <w:r>
+        <w:t>, Image Quality Assessment: From Error Visibility to Structural Similarity, IEEE TIP, 2004.</w:t>
+      </w:r>
+    </w:p>
+    <w:p>
+      <w:r>
+        <w:t xml:space="preserve">[3] A. </w:t>
+      </w:r>
+      <w:proofErr w:type="spellStart"/>
+      <w:r>
+        <w:t>Paszke</w:t>
+      </w:r>
+      <w:proofErr w:type="spellEnd"/>
+      <w:r>
+        <w:t xml:space="preserve"> et al., </w:t>
+      </w:r>
+      <w:proofErr w:type="spellStart"/>
+      <w:r>
+        <w:t>PyTorch</w:t>
+      </w:r>
+      <w:proofErr w:type="spellEnd"/>
+      <w:r>
+        <w:t xml:space="preserve">: An Imperative Style, High-Performance Deep Learning Library, </w:t>
+      </w:r>
+      <w:proofErr w:type="spellStart"/>
+      <w:r>
+        <w:t>NeurIPS</w:t>
+      </w:r>
+      <w:proofErr w:type="spellEnd"/>
+      <w:r>
+        <w:t>, 2019.</w:t>
+      </w:r>
+    </w:p>
+    <w:p>
+      <w:r>
+        <w:t>[4] M. Abadi et al., TensorFlow: A System for Large-Scale Machine Learning, OSDI, 2016.</w:t>
+      </w:r>
+    </w:p>
+    <w:p>
+      <w:r>
+        <w:t xml:space="preserve">[5] OpenCV Contributors, </w:t>
+      </w:r>
+      <w:proofErr w:type="gramStart"/>
+      <w:r>
+        <w:t>Open Source</w:t>
+      </w:r>
+      <w:proofErr w:type="gramEnd"/>
+      <w:r>
+        <w:t xml:space="preserve"> Computer Vision Library, https://opencv.org/.</w:t>
+      </w:r>
+    </w:p>
+    <w:p>
+      <w:r>
+        <w:t xml:space="preserve">[6] F. </w:t>
+      </w:r>
+      <w:proofErr w:type="spellStart"/>
+      <w:r>
+        <w:t>Pedregosa</w:t>
+      </w:r>
+      <w:proofErr w:type="spellEnd"/>
+      <w:r>
+        <w:t xml:space="preserve"> et al., Scikit-image: Image Processing in Python, JMLR, 2014.</w:t>
+      </w:r>
+    </w:p>
+    <w:p>
+      <w:r>
+        <w:t>[7] Machine Learning / Deep Learning Course Lecture Notes (PDF), provided by the instructor.</w:t>
       </w:r>
     </w:p>
     <w:sectPr>
@@ -6042,6 +7717,92 @@
     </w:lvl>
   </w:abstractNum>
   <w:abstractNum w:abstractNumId="26" w15:restartNumberingAfterBreak="0">
+    <w:nsid w:val="519753AC"/>
+    <w:multiLevelType w:val="hybridMultilevel"/>
+    <w:tmpl w:val="82125284"/>
+    <w:lvl w:ilvl="0" w:tplc="04090013">
+      <w:start w:val="1"/>
+      <w:numFmt w:val="upperRoman"/>
+      <w:lvlText w:val="%1."/>
+      <w:lvlJc w:val="right"/>
+      <w:pPr>
+        <w:ind w:left="720" w:hanging="360"/>
+      </w:pPr>
+    </w:lvl>
+    <w:lvl w:ilvl="1" w:tplc="04090019" w:tentative="1">
+      <w:start w:val="1"/>
+      <w:numFmt w:val="lowerLetter"/>
+      <w:lvlText w:val="%2."/>
+      <w:lvlJc w:val="left"/>
+      <w:pPr>
+        <w:ind w:left="1440" w:hanging="360"/>
+      </w:pPr>
+    </w:lvl>
+    <w:lvl w:ilvl="2" w:tplc="0409001B" w:tentative="1">
+      <w:start w:val="1"/>
+      <w:numFmt w:val="lowerRoman"/>
+      <w:lvlText w:val="%3."/>
+      <w:lvlJc w:val="right"/>
+      <w:pPr>
+        <w:ind w:left="2160" w:hanging="180"/>
+      </w:pPr>
+    </w:lvl>
+    <w:lvl w:ilvl="3" w:tplc="0409000F" w:tentative="1">
+      <w:start w:val="1"/>
+      <w:numFmt w:val="decimal"/>
+      <w:lvlText w:val="%4."/>
+      <w:lvlJc w:val="left"/>
+      <w:pPr>
+        <w:ind w:left="2880" w:hanging="360"/>
+      </w:pPr>
+    </w:lvl>
+    <w:lvl w:ilvl="4" w:tplc="04090019" w:tentative="1">
+      <w:start w:val="1"/>
+      <w:numFmt w:val="lowerLetter"/>
+      <w:lvlText w:val="%5."/>
+      <w:lvlJc w:val="left"/>
+      <w:pPr>
+        <w:ind w:left="3600" w:hanging="360"/>
+      </w:pPr>
+    </w:lvl>
+    <w:lvl w:ilvl="5" w:tplc="0409001B" w:tentative="1">
+      <w:start w:val="1"/>
+      <w:numFmt w:val="lowerRoman"/>
+      <w:lvlText w:val="%6."/>
+      <w:lvlJc w:val="right"/>
+      <w:pPr>
+        <w:ind w:left="4320" w:hanging="180"/>
+      </w:pPr>
+    </w:lvl>
+    <w:lvl w:ilvl="6" w:tplc="0409000F" w:tentative="1">
+      <w:start w:val="1"/>
+      <w:numFmt w:val="decimal"/>
+      <w:lvlText w:val="%7."/>
+      <w:lvlJc w:val="left"/>
+      <w:pPr>
+        <w:ind w:left="5040" w:hanging="360"/>
+      </w:pPr>
+    </w:lvl>
+    <w:lvl w:ilvl="7" w:tplc="04090019" w:tentative="1">
+      <w:start w:val="1"/>
+      <w:numFmt w:val="lowerLetter"/>
+      <w:lvlText w:val="%8."/>
+      <w:lvlJc w:val="left"/>
+      <w:pPr>
+        <w:ind w:left="5760" w:hanging="360"/>
+      </w:pPr>
+    </w:lvl>
+    <w:lvl w:ilvl="8" w:tplc="0409001B" w:tentative="1">
+      <w:start w:val="1"/>
+      <w:numFmt w:val="lowerRoman"/>
+      <w:lvlText w:val="%9."/>
+      <w:lvlJc w:val="right"/>
+      <w:pPr>
+        <w:ind w:left="6480" w:hanging="180"/>
+      </w:pPr>
+    </w:lvl>
+  </w:abstractNum>
+  <w:abstractNum w:abstractNumId="27" w15:restartNumberingAfterBreak="0">
     <w:nsid w:val="54423669"/>
     <w:multiLevelType w:val="hybridMultilevel"/>
     <w:tmpl w:val="10F60A0A"/>
@@ -6154,7 +7915,7 @@
       </w:rPr>
     </w:lvl>
   </w:abstractNum>
-  <w:abstractNum w:abstractNumId="27" w15:restartNumberingAfterBreak="0">
+  <w:abstractNum w:abstractNumId="28" w15:restartNumberingAfterBreak="0">
     <w:nsid w:val="55987400"/>
     <w:multiLevelType w:val="hybridMultilevel"/>
     <w:tmpl w:val="51E2D5A8"/>
@@ -6266,7 +8027,7 @@
       </w:rPr>
     </w:lvl>
   </w:abstractNum>
-  <w:abstractNum w:abstractNumId="28" w15:restartNumberingAfterBreak="0">
+  <w:abstractNum w:abstractNumId="29" w15:restartNumberingAfterBreak="0">
     <w:nsid w:val="63C414E0"/>
     <w:multiLevelType w:val="hybridMultilevel"/>
     <w:tmpl w:val="1D0E1432"/>
@@ -6378,7 +8139,120 @@
       </w:rPr>
     </w:lvl>
   </w:abstractNum>
-  <w:abstractNum w:abstractNumId="29" w15:restartNumberingAfterBreak="0">
+  <w:abstractNum w:abstractNumId="30" w15:restartNumberingAfterBreak="0">
+    <w:nsid w:val="63E511CF"/>
+    <w:multiLevelType w:val="hybridMultilevel"/>
+    <w:tmpl w:val="DE04DF54"/>
+    <w:lvl w:ilvl="0" w:tplc="04090001">
+      <w:start w:val="1"/>
+      <w:numFmt w:val="bullet"/>
+      <w:lvlText w:val=""/>
+      <w:lvlJc w:val="left"/>
+      <w:pPr>
+        <w:ind w:left="720" w:hanging="360"/>
+      </w:pPr>
+      <w:rPr>
+        <w:rFonts w:ascii="Symbol" w:hAnsi="Symbol" w:hint="default"/>
+      </w:rPr>
+    </w:lvl>
+    <w:lvl w:ilvl="1" w:tplc="04090003" w:tentative="1">
+      <w:start w:val="1"/>
+      <w:numFmt w:val="bullet"/>
+      <w:lvlText w:val="o"/>
+      <w:lvlJc w:val="left"/>
+      <w:pPr>
+        <w:ind w:left="1440" w:hanging="360"/>
+      </w:pPr>
+      <w:rPr>
+        <w:rFonts w:ascii="Courier New" w:hAnsi="Courier New" w:cs="Courier New" w:hint="default"/>
+      </w:rPr>
+    </w:lvl>
+    <w:lvl w:ilvl="2" w:tplc="04090005" w:tentative="1">
+      <w:start w:val="1"/>
+      <w:numFmt w:val="bullet"/>
+      <w:lvlText w:val=""/>
+      <w:lvlJc w:val="left"/>
+      <w:pPr>
+        <w:ind w:left="2160" w:hanging="360"/>
+      </w:pPr>
+      <w:rPr>
+        <w:rFonts w:ascii="Wingdings" w:hAnsi="Wingdings" w:hint="default"/>
+      </w:rPr>
+    </w:lvl>
+    <w:lvl w:ilvl="3" w:tplc="04090001" w:tentative="1">
+      <w:start w:val="1"/>
+      <w:numFmt w:val="bullet"/>
+      <w:lvlText w:val=""/>
+      <w:lvlJc w:val="left"/>
+      <w:pPr>
+        <w:ind w:left="2880" w:hanging="360"/>
+      </w:pPr>
+      <w:rPr>
+        <w:rFonts w:ascii="Symbol" w:hAnsi="Symbol" w:hint="default"/>
+      </w:rPr>
+    </w:lvl>
+    <w:lvl w:ilvl="4" w:tplc="04090003" w:tentative="1">
+      <w:start w:val="1"/>
+      <w:numFmt w:val="bullet"/>
+      <w:lvlText w:val="o"/>
+      <w:lvlJc w:val="left"/>
+      <w:pPr>
+        <w:ind w:left="3600" w:hanging="360"/>
+      </w:pPr>
+      <w:rPr>
+        <w:rFonts w:ascii="Courier New" w:hAnsi="Courier New" w:cs="Courier New" w:hint="default"/>
+      </w:rPr>
+    </w:lvl>
+    <w:lvl w:ilvl="5" w:tplc="04090005" w:tentative="1">
+      <w:start w:val="1"/>
+      <w:numFmt w:val="bullet"/>
+      <w:lvlText w:val=""/>
+      <w:lvlJc w:val="left"/>
+      <w:pPr>
+        <w:ind w:left="4320" w:hanging="360"/>
+      </w:pPr>
+      <w:rPr>
+        <w:rFonts w:ascii="Wingdings" w:hAnsi="Wingdings" w:hint="default"/>
+      </w:rPr>
+    </w:lvl>
+    <w:lvl w:ilvl="6" w:tplc="04090001" w:tentative="1">
+      <w:start w:val="1"/>
+      <w:numFmt w:val="bullet"/>
+      <w:lvlText w:val=""/>
+      <w:lvlJc w:val="left"/>
+      <w:pPr>
+        <w:ind w:left="5040" w:hanging="360"/>
+      </w:pPr>
+      <w:rPr>
+        <w:rFonts w:ascii="Symbol" w:hAnsi="Symbol" w:hint="default"/>
+      </w:rPr>
+    </w:lvl>
+    <w:lvl w:ilvl="7" w:tplc="04090003" w:tentative="1">
+      <w:start w:val="1"/>
+      <w:numFmt w:val="bullet"/>
+      <w:lvlText w:val="o"/>
+      <w:lvlJc w:val="left"/>
+      <w:pPr>
+        <w:ind w:left="5760" w:hanging="360"/>
+      </w:pPr>
+      <w:rPr>
+        <w:rFonts w:ascii="Courier New" w:hAnsi="Courier New" w:cs="Courier New" w:hint="default"/>
+      </w:rPr>
+    </w:lvl>
+    <w:lvl w:ilvl="8" w:tplc="04090005" w:tentative="1">
+      <w:start w:val="1"/>
+      <w:numFmt w:val="bullet"/>
+      <w:lvlText w:val=""/>
+      <w:lvlJc w:val="left"/>
+      <w:pPr>
+        <w:ind w:left="6480" w:hanging="360"/>
+      </w:pPr>
+      <w:rPr>
+        <w:rFonts w:ascii="Wingdings" w:hAnsi="Wingdings" w:hint="default"/>
+      </w:rPr>
+    </w:lvl>
+  </w:abstractNum>
+  <w:abstractNum w:abstractNumId="31" w15:restartNumberingAfterBreak="0">
     <w:nsid w:val="644B58F3"/>
     <w:multiLevelType w:val="multilevel"/>
     <w:tmpl w:val="72861994"/>
@@ -6491,7 +8365,93 @@
       </w:rPr>
     </w:lvl>
   </w:abstractNum>
-  <w:abstractNum w:abstractNumId="30" w15:restartNumberingAfterBreak="0">
+  <w:abstractNum w:abstractNumId="32" w15:restartNumberingAfterBreak="0">
+    <w:nsid w:val="64B71E06"/>
+    <w:multiLevelType w:val="hybridMultilevel"/>
+    <w:tmpl w:val="F62A61F4"/>
+    <w:lvl w:ilvl="0" w:tplc="04090013">
+      <w:start w:val="1"/>
+      <w:numFmt w:val="upperRoman"/>
+      <w:lvlText w:val="%1."/>
+      <w:lvlJc w:val="right"/>
+      <w:pPr>
+        <w:ind w:left="720" w:hanging="360"/>
+      </w:pPr>
+    </w:lvl>
+    <w:lvl w:ilvl="1" w:tplc="04090019" w:tentative="1">
+      <w:start w:val="1"/>
+      <w:numFmt w:val="lowerLetter"/>
+      <w:lvlText w:val="%2."/>
+      <w:lvlJc w:val="left"/>
+      <w:pPr>
+        <w:ind w:left="1440" w:hanging="360"/>
+      </w:pPr>
+    </w:lvl>
+    <w:lvl w:ilvl="2" w:tplc="0409001B" w:tentative="1">
+      <w:start w:val="1"/>
+      <w:numFmt w:val="lowerRoman"/>
+      <w:lvlText w:val="%3."/>
+      <w:lvlJc w:val="right"/>
+      <w:pPr>
+        <w:ind w:left="2160" w:hanging="180"/>
+      </w:pPr>
+    </w:lvl>
+    <w:lvl w:ilvl="3" w:tplc="0409000F" w:tentative="1">
+      <w:start w:val="1"/>
+      <w:numFmt w:val="decimal"/>
+      <w:lvlText w:val="%4."/>
+      <w:lvlJc w:val="left"/>
+      <w:pPr>
+        <w:ind w:left="2880" w:hanging="360"/>
+      </w:pPr>
+    </w:lvl>
+    <w:lvl w:ilvl="4" w:tplc="04090019" w:tentative="1">
+      <w:start w:val="1"/>
+      <w:numFmt w:val="lowerLetter"/>
+      <w:lvlText w:val="%5."/>
+      <w:lvlJc w:val="left"/>
+      <w:pPr>
+        <w:ind w:left="3600" w:hanging="360"/>
+      </w:pPr>
+    </w:lvl>
+    <w:lvl w:ilvl="5" w:tplc="0409001B" w:tentative="1">
+      <w:start w:val="1"/>
+      <w:numFmt w:val="lowerRoman"/>
+      <w:lvlText w:val="%6."/>
+      <w:lvlJc w:val="right"/>
+      <w:pPr>
+        <w:ind w:left="4320" w:hanging="180"/>
+      </w:pPr>
+    </w:lvl>
+    <w:lvl w:ilvl="6" w:tplc="0409000F" w:tentative="1">
+      <w:start w:val="1"/>
+      <w:numFmt w:val="decimal"/>
+      <w:lvlText w:val="%7."/>
+      <w:lvlJc w:val="left"/>
+      <w:pPr>
+        <w:ind w:left="5040" w:hanging="360"/>
+      </w:pPr>
+    </w:lvl>
+    <w:lvl w:ilvl="7" w:tplc="04090019" w:tentative="1">
+      <w:start w:val="1"/>
+      <w:numFmt w:val="lowerLetter"/>
+      <w:lvlText w:val="%8."/>
+      <w:lvlJc w:val="left"/>
+      <w:pPr>
+        <w:ind w:left="5760" w:hanging="360"/>
+      </w:pPr>
+    </w:lvl>
+    <w:lvl w:ilvl="8" w:tplc="0409001B" w:tentative="1">
+      <w:start w:val="1"/>
+      <w:numFmt w:val="lowerRoman"/>
+      <w:lvlText w:val="%9."/>
+      <w:lvlJc w:val="right"/>
+      <w:pPr>
+        <w:ind w:left="6480" w:hanging="180"/>
+      </w:pPr>
+    </w:lvl>
+  </w:abstractNum>
+  <w:abstractNum w:abstractNumId="33" w15:restartNumberingAfterBreak="0">
     <w:nsid w:val="6A824351"/>
     <w:multiLevelType w:val="hybridMultilevel"/>
     <w:tmpl w:val="593CA9E8"/>
@@ -6604,7 +8564,93 @@
       </w:rPr>
     </w:lvl>
   </w:abstractNum>
-  <w:abstractNum w:abstractNumId="31" w15:restartNumberingAfterBreak="0">
+  <w:abstractNum w:abstractNumId="34" w15:restartNumberingAfterBreak="0">
+    <w:nsid w:val="6CAF40F6"/>
+    <w:multiLevelType w:val="hybridMultilevel"/>
+    <w:tmpl w:val="A3B6267E"/>
+    <w:lvl w:ilvl="0" w:tplc="04090013">
+      <w:start w:val="1"/>
+      <w:numFmt w:val="upperRoman"/>
+      <w:lvlText w:val="%1."/>
+      <w:lvlJc w:val="right"/>
+      <w:pPr>
+        <w:ind w:left="720" w:hanging="360"/>
+      </w:pPr>
+    </w:lvl>
+    <w:lvl w:ilvl="1" w:tplc="04090019" w:tentative="1">
+      <w:start w:val="1"/>
+      <w:numFmt w:val="lowerLetter"/>
+      <w:lvlText w:val="%2."/>
+      <w:lvlJc w:val="left"/>
+      <w:pPr>
+        <w:ind w:left="1440" w:hanging="360"/>
+      </w:pPr>
+    </w:lvl>
+    <w:lvl w:ilvl="2" w:tplc="0409001B" w:tentative="1">
+      <w:start w:val="1"/>
+      <w:numFmt w:val="lowerRoman"/>
+      <w:lvlText w:val="%3."/>
+      <w:lvlJc w:val="right"/>
+      <w:pPr>
+        <w:ind w:left="2160" w:hanging="180"/>
+      </w:pPr>
+    </w:lvl>
+    <w:lvl w:ilvl="3" w:tplc="0409000F" w:tentative="1">
+      <w:start w:val="1"/>
+      <w:numFmt w:val="decimal"/>
+      <w:lvlText w:val="%4."/>
+      <w:lvlJc w:val="left"/>
+      <w:pPr>
+        <w:ind w:left="2880" w:hanging="360"/>
+      </w:pPr>
+    </w:lvl>
+    <w:lvl w:ilvl="4" w:tplc="04090019" w:tentative="1">
+      <w:start w:val="1"/>
+      <w:numFmt w:val="lowerLetter"/>
+      <w:lvlText w:val="%5."/>
+      <w:lvlJc w:val="left"/>
+      <w:pPr>
+        <w:ind w:left="3600" w:hanging="360"/>
+      </w:pPr>
+    </w:lvl>
+    <w:lvl w:ilvl="5" w:tplc="0409001B" w:tentative="1">
+      <w:start w:val="1"/>
+      <w:numFmt w:val="lowerRoman"/>
+      <w:lvlText w:val="%6."/>
+      <w:lvlJc w:val="right"/>
+      <w:pPr>
+        <w:ind w:left="4320" w:hanging="180"/>
+      </w:pPr>
+    </w:lvl>
+    <w:lvl w:ilvl="6" w:tplc="0409000F" w:tentative="1">
+      <w:start w:val="1"/>
+      <w:numFmt w:val="decimal"/>
+      <w:lvlText w:val="%7."/>
+      <w:lvlJc w:val="left"/>
+      <w:pPr>
+        <w:ind w:left="5040" w:hanging="360"/>
+      </w:pPr>
+    </w:lvl>
+    <w:lvl w:ilvl="7" w:tplc="04090019" w:tentative="1">
+      <w:start w:val="1"/>
+      <w:numFmt w:val="lowerLetter"/>
+      <w:lvlText w:val="%8."/>
+      <w:lvlJc w:val="left"/>
+      <w:pPr>
+        <w:ind w:left="5760" w:hanging="360"/>
+      </w:pPr>
+    </w:lvl>
+    <w:lvl w:ilvl="8" w:tplc="0409001B" w:tentative="1">
+      <w:start w:val="1"/>
+      <w:numFmt w:val="lowerRoman"/>
+      <w:lvlText w:val="%9."/>
+      <w:lvlJc w:val="right"/>
+      <w:pPr>
+        <w:ind w:left="6480" w:hanging="180"/>
+      </w:pPr>
+    </w:lvl>
+  </w:abstractNum>
+  <w:abstractNum w:abstractNumId="35" w15:restartNumberingAfterBreak="0">
     <w:nsid w:val="6EC53B19"/>
     <w:multiLevelType w:val="hybridMultilevel"/>
     <w:tmpl w:val="D0B07D62"/>
@@ -6717,7 +8763,7 @@
       </w:rPr>
     </w:lvl>
   </w:abstractNum>
-  <w:abstractNum w:abstractNumId="32" w15:restartNumberingAfterBreak="0">
+  <w:abstractNum w:abstractNumId="36" w15:restartNumberingAfterBreak="0">
     <w:nsid w:val="705F2CC3"/>
     <w:multiLevelType w:val="hybridMultilevel"/>
     <w:tmpl w:val="DD128490"/>
@@ -6830,7 +8876,7 @@
       </w:rPr>
     </w:lvl>
   </w:abstractNum>
-  <w:abstractNum w:abstractNumId="33" w15:restartNumberingAfterBreak="0">
+  <w:abstractNum w:abstractNumId="37" w15:restartNumberingAfterBreak="0">
     <w:nsid w:val="735600D0"/>
     <w:multiLevelType w:val="hybridMultilevel"/>
     <w:tmpl w:val="BF1E94B2"/>
@@ -6943,7 +8989,7 @@
       </w:rPr>
     </w:lvl>
   </w:abstractNum>
-  <w:abstractNum w:abstractNumId="34" w15:restartNumberingAfterBreak="0">
+  <w:abstractNum w:abstractNumId="38" w15:restartNumberingAfterBreak="0">
     <w:nsid w:val="737C1AAC"/>
     <w:multiLevelType w:val="hybridMultilevel"/>
     <w:tmpl w:val="D9DE991C"/>
@@ -7055,7 +9101,7 @@
       </w:rPr>
     </w:lvl>
   </w:abstractNum>
-  <w:abstractNum w:abstractNumId="35" w15:restartNumberingAfterBreak="0">
+  <w:abstractNum w:abstractNumId="39" w15:restartNumberingAfterBreak="0">
     <w:nsid w:val="79493533"/>
     <w:multiLevelType w:val="hybridMultilevel"/>
     <w:tmpl w:val="6C2AE36E"/>
@@ -7167,7 +9213,7 @@
       </w:rPr>
     </w:lvl>
   </w:abstractNum>
-  <w:abstractNum w:abstractNumId="36" w15:restartNumberingAfterBreak="0">
+  <w:abstractNum w:abstractNumId="40" w15:restartNumberingAfterBreak="0">
     <w:nsid w:val="7E01482D"/>
     <w:multiLevelType w:val="hybridMultilevel"/>
     <w:tmpl w:val="43A80714"/>
@@ -7279,7 +9325,7 @@
       </w:rPr>
     </w:lvl>
   </w:abstractNum>
-  <w:abstractNum w:abstractNumId="37" w15:restartNumberingAfterBreak="0">
+  <w:abstractNum w:abstractNumId="41" w15:restartNumberingAfterBreak="0">
     <w:nsid w:val="7ED03C7E"/>
     <w:multiLevelType w:val="hybridMultilevel"/>
     <w:tmpl w:val="D7CC5716"/>
@@ -7432,10 +9478,10 @@
     <w:abstractNumId w:val="20"/>
   </w:num>
   <w:num w:numId="14">
-    <w:abstractNumId w:val="33"/>
+    <w:abstractNumId w:val="37"/>
   </w:num>
   <w:num w:numId="15">
-    <w:abstractNumId w:val="31"/>
+    <w:abstractNumId w:val="35"/>
   </w:num>
   <w:num w:numId="16">
     <w:abstractNumId w:val="13"/>
@@ -7444,10 +9490,10 @@
     <w:abstractNumId w:val="9"/>
   </w:num>
   <w:num w:numId="18">
-    <w:abstractNumId w:val="32"/>
+    <w:abstractNumId w:val="36"/>
   </w:num>
   <w:num w:numId="19">
-    <w:abstractNumId w:val="26"/>
+    <w:abstractNumId w:val="27"/>
   </w:num>
   <w:num w:numId="20">
     <w:abstractNumId w:val="16"/>
@@ -7456,25 +9502,25 @@
     <w:abstractNumId w:val="19"/>
   </w:num>
   <w:num w:numId="22">
-    <w:abstractNumId w:val="27"/>
+    <w:abstractNumId w:val="28"/>
   </w:num>
   <w:num w:numId="23">
-    <w:abstractNumId w:val="36"/>
+    <w:abstractNumId w:val="40"/>
   </w:num>
   <w:num w:numId="24">
     <w:abstractNumId w:val="14"/>
   </w:num>
   <w:num w:numId="25">
-    <w:abstractNumId w:val="35"/>
+    <w:abstractNumId w:val="39"/>
   </w:num>
   <w:num w:numId="26">
-    <w:abstractNumId w:val="28"/>
+    <w:abstractNumId w:val="29"/>
   </w:num>
   <w:num w:numId="27">
-    <w:abstractNumId w:val="30"/>
+    <w:abstractNumId w:val="33"/>
   </w:num>
   <w:num w:numId="28">
-    <w:abstractNumId w:val="37"/>
+    <w:abstractNumId w:val="41"/>
   </w:num>
   <w:num w:numId="29">
     <w:abstractNumId w:val="11"/>
@@ -7483,7 +9529,7 @@
     <w:abstractNumId w:val="25"/>
   </w:num>
   <w:num w:numId="31">
-    <w:abstractNumId w:val="34"/>
+    <w:abstractNumId w:val="38"/>
   </w:num>
   <w:num w:numId="32">
     <w:abstractNumId w:val="18"/>
@@ -7492,7 +9538,7 @@
     <w:abstractNumId w:val="22"/>
   </w:num>
   <w:num w:numId="34">
-    <w:abstractNumId w:val="29"/>
+    <w:abstractNumId w:val="31"/>
   </w:num>
   <w:num w:numId="35">
     <w:abstractNumId w:val="21"/>
@@ -7505,6 +9551,18 @@
   </w:num>
   <w:num w:numId="38">
     <w:abstractNumId w:val="24"/>
+  </w:num>
+  <w:num w:numId="39">
+    <w:abstractNumId w:val="30"/>
+  </w:num>
+  <w:num w:numId="40">
+    <w:abstractNumId w:val="26"/>
+  </w:num>
+  <w:num w:numId="41">
+    <w:abstractNumId w:val="32"/>
+  </w:num>
+  <w:num w:numId="42">
+    <w:abstractNumId w:val="34"/>
   </w:num>
 </w:numbering>
 </file>

</xml_diff>